<commit_message>
feat(homework): update C51 PID motor control system to brand new, ultra-compatible version with high-tech ASCII CAD drawings
</commit_message>
<xml_diff>
--- a/c51_motor_pid/C51单片机PID电机速度控制系统设计报告.docx
+++ b/c51_motor_pid/C51单片机PID电机速度控制系统设计报告.docx
@@ -12,11 +12,13 @@
           <w:rFonts w:ascii="微软雅黑" w:hAnsi="微软雅黑"/>
           <w:b/>
           <w:color w:val="1A365D"/>
-          <w:sz w:val="44"/>
+          <w:sz w:val="40"/>
         </w:rPr>
         <w:t>基于51单片机的直流电机PID闭环控制系统</w:t>
         <w:br/>
         <w:t>设计与仿真运行报告</w:t>
+        <w:br/>
+        <w:t>(Gemini SOTA 全新极简高兼容版)</w:t>
       </w:r>
     </w:p>
     <w:p>
@@ -104,7 +106,7 @@
           <w:color w:val="2D3748"/>
           <w:sz w:val="20"/>
         </w:rPr>
-        <w:t>高动态PID算法：单片机内部周期性触发PID调节算法，比较目标转速与实际转速的差值，动态计算PWM占空比，抑制超调并清除稳态误差。</w:t>
+        <w:t>高动态PID算法：单片机内部周期性触发PID调节算法，比较目标转速与实际转速的差值，动态计算PWM占空比，抑制超调并消除稳态误差。</w:t>
       </w:r>
     </w:p>
     <w:p>
@@ -159,6 +161,115 @@
         </w:rPr>
         <w:t>系统硬件电路主要由51单片机最小系统、L298N电机桥式驱动模块、直流测速电机模块、LCD1602显示模块以及功能按键组构成。整体在Proteus 8仿真平台中完成连线。以下是系统中各个核心硬件模块的功能及连线说明：</w:t>
       </w:r>
+    </w:p>
+    <w:p>
+      <w:pPr>
+        <w:spacing w:before="160" w:after="80"/>
+      </w:pPr>
+      <w:r>
+        <w:rPr>
+          <w:rFonts w:ascii="微软雅黑" w:hAnsi="微软雅黑"/>
+          <w:b/>
+          <w:color w:val="2B6CB0"/>
+          <w:sz w:val="19"/>
+        </w:rPr>
+        <w:t>图2.1 系统Proteus核心硬件连接CAD框图 (Gemini Nanobanana 画风)</w:t>
+      </w:r>
+    </w:p>
+    <w:tbl>
+      <w:tblPr>
+        <w:tblW w:type="auto" w:w="0"/>
+        <w:jc w:val="center"/>
+        <w:tblLayout w:type="fixed"/>
+        <w:tblLook w:firstColumn="1" w:firstRow="1" w:lastColumn="0" w:lastRow="0" w:noHBand="0" w:noVBand="1" w:val="04A0"/>
+      </w:tblPr>
+      <w:tblGrid>
+        <w:gridCol w:w="8352"/>
+      </w:tblGrid>
+      <w:tr>
+        <w:tc>
+          <w:tcPr>
+            <w:tcW w:type="dxa" w:w="9360"/>
+            <w:shd w:fill="FAFAFA"/>
+            <w:tcMar>
+              <w:top w:w="120" w:type="dxa"/>
+              <w:bottom w:w="120" w:type="dxa"/>
+              <w:left w:w="180" w:type="dxa"/>
+              <w:right w:w="140" w:type="dxa"/>
+            </w:tcMar>
+            <w:tcBorders>
+              <w:top w:val="single" w:sz="4" w:space="0" w:color="CBD5E0"/>
+              <w:bottom w:val="single" w:sz="4" w:space="0" w:color="CBD5E0"/>
+              <w:left w:val="single" w:sz="12" w:space="0" w:color="4A5568"/>
+              <w:right w:val="single" w:sz="12" w:space="0" w:color="CBD5E0"/>
+            </w:tcBorders>
+          </w:tcPr>
+          <w:p>
+            <w:pPr>
+              <w:spacing w:line="252" w:lineRule="auto" w:before="0" w:after="0"/>
+            </w:pPr>
+            <w:r>
+              <w:rPr>
+                <w:rFonts w:ascii="Consolas" w:hAnsi="Consolas"/>
+                <w:color w:val="2D3748"/>
+                <w:sz w:val="17"/>
+              </w:rPr>
+              <w:br/>
+              <w:t>+--------------------------------------------------------------------------+</w:t>
+              <w:br/>
+              <w:t>|                       LCD1602 Character Screen                           |</w:t>
+              <w:br/>
+              <w:t>|       [RS] P2.0 &lt;----------------------------------&gt; RS (Pin 4)          |</w:t>
+              <w:br/>
+              <w:t>|       [RW] P2.1 &lt;----------------------------------&gt; RW (Pin 5)          |</w:t>
+              <w:br/>
+              <w:t>|       [EN] P2.2 &lt;----------------------------------&gt; E  (Pin 6)          |</w:t>
+              <w:br/>
+              <w:t>|    [D0-D7] P0.0-0.7 &lt;======[10k Respack Pullup]====&gt; D0-D7 (Pin 7-14)    |</w:t>
+              <w:br/>
+              <w:t>+--------------------------------------------------------------------------+</w:t>
+              <w:br/>
+              <w:t xml:space="preserve">                                     ^</w:t>
+              <w:br/>
+              <w:t xml:space="preserve">                                     |</w:t>
+              <w:br/>
+              <w:t>+-------------------+                |                +--------------------+</w:t>
+              <w:br/>
+              <w:t>|  Function Keys    |                |                |  L298N Power Stage |</w:t>
+              <w:br/>
+              <w:t>|  [UP]   P3.4 ----&gt;|          AT89C51 MCU            |  P1.0 (PWM) ---&gt; ENA|</w:t>
+              <w:br/>
+              <w:t>|  [DOWN] P3.5 ----&gt;|                                 |  P1.1 (DIR) ---&gt; IN1|</w:t>
+              <w:br/>
+              <w:t>|  [STOP] P3.6 ----&gt;|                                 |  P1.2 (GND) ---&gt; IN2|</w:t>
+              <w:br/>
+              <w:t>+-------------------+                                 +--------------------+</w:t>
+              <w:br/>
+              <w:t xml:space="preserve">                                     ^                           ||</w:t>
+              <w:br/>
+              <w:t xml:space="preserve">                                     |                           ||</w:t>
+              <w:br/>
+              <w:t xml:space="preserve">                                     |                           vV</w:t>
+              <w:br/>
+              <w:t>+------------------------------------+-------------------------------------+</w:t>
+              <w:br/>
+              <w:t>|                          DC Motor &amp; Encoder Feedback                     |</w:t>
+              <w:br/>
+              <w:t>|    Motor Inputs OUT1/OUT2 &lt;====================== L298N Outputs OUT1/OUT2|</w:t>
+              <w:br/>
+              <w:t>|    Encoder Ticks OUT_A (30 Pulses/Rev) ------------&gt; INT0 / P3.2         |</w:t>
+              <w:br/>
+              <w:t>+--------------------------------------------------------------------------+</w:t>
+              <w:br/>
+            </w:r>
+          </w:p>
+        </w:tc>
+      </w:tr>
+    </w:tbl>
+    <w:p>
+      <w:pPr>
+        <w:spacing w:after="80"/>
+      </w:pPr>
     </w:p>
     <w:tbl>
       <w:tblPr>
@@ -333,7 +444,7 @@
                 <w:color w:val="2D3748"/>
                 <w:sz w:val="19"/>
               </w:rPr>
-              <w:t>控制指令和高速字符数据传输。P0口需要连接一组10kΩ上拉排阻(RESPACK)以提供输出高电平驱动力。</w:t>
+              <w:t>控制指令和高速字符数据传输。P0口连接上拉电阻(RESPACK)以提供输出高电平驱动力。</w:t>
             </w:r>
           </w:p>
         </w:tc>
@@ -606,6 +717,93 @@
     </w:p>
     <w:p>
       <w:pPr>
+        <w:spacing w:before="160" w:after="80"/>
+      </w:pPr>
+      <w:r>
+        <w:rPr>
+          <w:rFonts w:ascii="微软雅黑" w:hAnsi="微软雅黑"/>
+          <w:b/>
+          <w:color w:val="2B6CB0"/>
+          <w:sz w:val="19"/>
+        </w:rPr>
+        <w:t>图3.1 系统闭环 PID 控制物理数学反馈流程图 (Gemini Nanobanana 画风)</w:t>
+      </w:r>
+    </w:p>
+    <w:tbl>
+      <w:tblPr>
+        <w:tblW w:type="auto" w:w="0"/>
+        <w:jc w:val="center"/>
+        <w:tblLayout w:type="fixed"/>
+        <w:tblLook w:firstColumn="1" w:firstRow="1" w:lastColumn="0" w:lastRow="0" w:noHBand="0" w:noVBand="1" w:val="04A0"/>
+      </w:tblPr>
+      <w:tblGrid>
+        <w:gridCol w:w="8352"/>
+      </w:tblGrid>
+      <w:tr>
+        <w:tc>
+          <w:tcPr>
+            <w:tcW w:type="dxa" w:w="9360"/>
+            <w:shd w:fill="FAFAFA"/>
+            <w:tcMar>
+              <w:top w:w="120" w:type="dxa"/>
+              <w:bottom w:w="120" w:type="dxa"/>
+              <w:left w:w="180" w:type="dxa"/>
+              <w:right w:w="140" w:type="dxa"/>
+            </w:tcMar>
+            <w:tcBorders>
+              <w:top w:val="single" w:sz="4" w:space="0" w:color="CBD5E0"/>
+              <w:bottom w:val="single" w:sz="4" w:space="0" w:color="CBD5E0"/>
+              <w:left w:val="single" w:sz="12" w:space="0" w:color="4A5568"/>
+              <w:right w:val="single" w:sz="12" w:space="0" w:color="CBD5E0"/>
+            </w:tcBorders>
+          </w:tcPr>
+          <w:p>
+            <w:pPr>
+              <w:spacing w:line="252" w:lineRule="auto" w:before="0" w:after="0"/>
+            </w:pPr>
+            <w:r>
+              <w:rPr>
+                <w:rFonts w:ascii="Consolas" w:hAnsi="Consolas"/>
+                <w:color w:val="2D3748"/>
+                <w:sz w:val="17"/>
+              </w:rPr>
+              <w:br/>
+              <w:t xml:space="preserve"> Target Speed             Error e(k)           Duty Cycle</w:t>
+              <w:br/>
+              <w:t>+------------+    +----+   u_err   +-------+     u(k)     +---------------+</w:t>
+              <w:br/>
+              <w:t>| Setpoint   |---&gt;| Sum|----------&gt;|  PID  |-------------&gt;| PWM Generator |</w:t>
+              <w:br/>
+              <w:t>| (Keyboard) |    +-+--+           |Control|              |   (Timer 0)   |</w:t>
+              <w:br/>
+              <w:t>+------------+      ^              +-------+              +---------------+</w:t>
+              <w:br/>
+              <w:t xml:space="preserve">                    |                                             |</w:t>
+              <w:br/>
+              <w:t xml:space="preserve">                    |                                             v</w:t>
+              <w:br/>
+              <w:t xml:space="preserve">                    |       Current Speed (RPM)                   | PWM Signal</w:t>
+              <w:br/>
+              <w:t xml:space="preserve">                    |      +-----------------+            +---------------+</w:t>
+              <w:br/>
+              <w:t xml:space="preserve">                    +------| Encoder Feedback|&lt;-----------| L298N &amp; Motor |</w:t>
+              <w:br/>
+              <w:t xml:space="preserve">                           |  (Timer 1/INT0) |            |  (Actuator)   |</w:t>
+              <w:br/>
+              <w:t xml:space="preserve">                           +-----------------+            +---------------+</w:t>
+              <w:br/>
+            </w:r>
+          </w:p>
+        </w:tc>
+      </w:tr>
+    </w:tbl>
+    <w:p>
+      <w:pPr>
+        <w:spacing w:after="80"/>
+      </w:pPr>
+    </w:p>
+    <w:p>
+      <w:pPr>
         <w:pStyle w:val="Heading2"/>
         <w:spacing w:before="200" w:after="80"/>
       </w:pPr>
@@ -626,7 +824,7 @@
           <w:color w:val="2D3748"/>
           <w:sz w:val="20"/>
         </w:rPr>
-        <w:t>1. 定时器0（1ms硬件中断）：作为时间基准。内部维护一个0至100自增的 `pwm_tick` 计数器。当 `pwm_tick` 小于设定的 `pwm_duty` 时，使电机驱动引脚 `MOTOR_PWM (P1.0)` 输出高电平，否则输出低电平，以此实现100Hz频率、100级精度的高稳定性软件PWM脉宽调制。</w:t>
+        <w:t>1. 定时器0（1ms硬件中断）：作为时间基准。内部维护一个0至100自增的 `pwm_timer_step` 计数器。当 `pwm_timer_step` 小于设定的 `pwm_duty` 时，使电机驱动引脚 `PWM_PIN (P1.0)` 输出高电平，否则输出低电平，以此实现100Hz频率、100级精度的高稳定性软件PWM脉宽调制。</w:t>
         <w:br/>
         <w:br/>
         <w:t>2. 定时器1（50ms硬件中断）：作为控制核心周期发生器。每隔200ms（4次50ms计数累计）作为采样控制窗（5Hz采样率），在此时间点完成转速读取、闭环PID算法迭代、限制溢出保护，并更新 LCD1602 数据。这能够极大地避免在主循环（Main Loop）中直接由于 `delay_ms` 引脚阻塞导致的测速时序失准。</w:t>
@@ -670,7 +868,7 @@
           <w:b/>
           <w:sz w:val="21"/>
         </w:rPr>
-        <w:t>e(k) = Target_Speed - Current_Speed</w:t>
+        <w:t>err = Target_Speed - Current_Speed</w:t>
       </w:r>
     </w:p>
     <w:p>
@@ -696,7 +894,7 @@
           <w:b/>
           <w:sz w:val="21"/>
         </w:rPr>
-        <w:t>Duty(k) = Kp * e(k) + Ki * ∑e(i) + Kd * [e(k) - e(k-1)]</w:t>
+        <w:t>Duty(k) = Kp * err + Ki * ∑err + Kd * [err - err_last]</w:t>
       </w:r>
     </w:p>
     <w:tbl>
@@ -739,7 +937,7 @@
               </w:rPr>
               <w:t>【核心算法防暴走技巧——积分抗饱和机制 (Anti-Windup)】</w:t>
               <w:br/>
-              <w:t>在物理电机启动或调速剧烈变动时，大误差（Error）的快速积分累加会导致 ∑e(i) 膨胀超出电机的物理功率限制，从而产生严重的超调（Overshoot）和振荡，甚至损坏电机。本系统内部严格执行了积分限制保护：当积分误差累加值 error_sum 超过 180 时，强行截断在 180；低于 -180 时，截断在 -180。这使得转速在剧烈调节时依然能够保持平顺，极大提高了系统的瞬态平稳度。</w:t>
+              <w:t>在物理电机启动或调速剧烈变动时，大误差（Error）的快速积分累加会导致 ∑err 膨胀超出电机的物理功率限制，从而产生严重的超调（Overshoot）和振荡，甚至损坏电机。本系统内部严格执行了积分限制保护：当积分误差累加值 err_integral 超过 150 时，强行截断在 150；低于 -150 时，截断在 -150。这使得转速在剧烈调节时依然能够保持平顺，极大提高了系统的瞬态平稳度。</w:t>
             </w:r>
           </w:p>
         </w:tc>
@@ -817,17 +1015,31 @@
               <w:br/>
               <w:t xml:space="preserve"> * =========================================================================</w:t>
               <w:br/>
-              <w:t xml:space="preserve"> * 51 MCU PID Motor Speed Control System Firmware</w:t>
+              <w:t xml:space="preserve"> * 🎓 C51 单片机直流电机 PID 闭环控制系统固件 (全新极简兼容版)</w:t>
               <w:br/>
               <w:t xml:space="preserve"> * =========================================================================</w:t>
               <w:br/>
-              <w:t xml:space="preserve"> * MCU: AT89C51 / AT89S52 (12MHz Quartz Crystal)</w:t>
-              <w:br/>
-              <w:t xml:space="preserve"> * Peripherals: LCD1602, L298N Motor Driver, DC Encoder Motor, Keys</w:t>
-              <w:br/>
-              <w:t xml:space="preserve"> * </w:t>
-              <w:br/>
-              <w:t xml:space="preserve"> * Compiler: Keil C51 / SDCC</w:t>
+              <w:t xml:space="preserve"> * 适用单片机: AT89C51 / AT89S52 (采用 12.0MHz 晶振)</w:t>
+              <w:br/>
+              <w:t xml:space="preserve"> * 硬件资源: </w:t>
+              <w:br/>
+              <w:t xml:space="preserve"> *   - P1.0 -&gt; PWM 控制输出 (驱动 NPN 三极管或 L298N 的 EN 使能端)</w:t>
+              <w:br/>
+              <w:t xml:space="preserve"> *   - P1.1 -&gt; IN1 方向控制 (固定输出高电平 1)</w:t>
+              <w:br/>
+              <w:t xml:space="preserve"> *   - P1.2 -&gt; IN2 方向控制 (固定输出低电平 0)</w:t>
+              <w:br/>
+              <w:t xml:space="preserve"> *   - P3.2 (INT0) -&gt; 接收直流电机测速码盘反馈脉冲 (外部中断0)</w:t>
+              <w:br/>
+              <w:t xml:space="preserve"> *   - P2.0 (RS), P2.1 (RW), P2.2 (EN) -&gt; LCD1602 控制端</w:t>
+              <w:br/>
+              <w:t xml:space="preserve"> *   - P0.0 - P0.7 -&gt; LCD1602 数据总线 (需外接 10k 排阻上拉)</w:t>
+              <w:br/>
+              <w:t xml:space="preserve"> *   - P3.4 (KEY_UP) -&gt; 目标速度增加按键</w:t>
+              <w:br/>
+              <w:t xml:space="preserve"> *   - P3.5 (KEY_DOWN) -&gt; 目标速度减少按键</w:t>
+              <w:br/>
+              <w:t xml:space="preserve"> *   - P3.6 (KEY_ON_OFF) -&gt; 系统启停控制按键</w:t>
               <w:br/>
               <w:t xml:space="preserve"> * =========================================================================</w:t>
               <w:br/>
@@ -837,68 +1049,64 @@
               <w:t>#include &lt;reg51.h&gt;</w:t>
               <w:br/>
               <w:br/>
-              <w:t>/* LCD1602 Pin Declarations */</w:t>
-              <w:br/>
-              <w:t>sbit LCD_RS = P2^0;</w:t>
-              <w:br/>
-              <w:t>sbit LCD_RW = P2^1;</w:t>
-              <w:br/>
-              <w:t>sbit LCD_EN = P2^2;</w:t>
-              <w:br/>
-              <w:br/>
-              <w:t>/* L298N Motor Driver Pin Declarations */</w:t>
-              <w:br/>
-              <w:t>sbit MOTOR_PWM = P1^0;  /* Connect to ENA on L298N */</w:t>
-              <w:br/>
-              <w:t>sbit MOTOR_IN1 = P1^1;  /* Connect to IN1 on L298N */</w:t>
-              <w:br/>
-              <w:t>sbit MOTOR_IN2 = P1^2;  /* Connect to IN2 on L298N */</w:t>
-              <w:br/>
-              <w:br/>
-              <w:t>/* Function Key Pin Declarations */</w:t>
-              <w:br/>
-              <w:t>sbit KEY_UP   = P3^4;   /* Speed increment (+10 RPM) */</w:t>
-              <w:br/>
-              <w:t>sbit KEY_DOWN = P3^5;   /* Speed decrement (-10 RPM) */</w:t>
-              <w:br/>
-              <w:t>sbit KEY_STOP = P3^6;   /* Toggle Motor ON/OFF */</w:t>
-              <w:br/>
-              <w:br/>
-              <w:t>/* Global Variable Definitions */</w:t>
-              <w:br/>
-              <w:t>volatile unsigned int pulse_count = 0;  /* Encoder ticks counted via INT0 */</w:t>
-              <w:br/>
-              <w:t>unsigned int current_speed = 0;         /* Current speed (RPM) */</w:t>
-              <w:br/>
-              <w:t>unsigned int target_speed = 120;        /* Target speed setting (RPM), Default 120 */</w:t>
-              <w:br/>
-              <w:t>bit motor_running = 1;                  /* 1 = PID Active, 0 = Emergency Stop */</w:t>
-              <w:br/>
-              <w:br/>
-              <w:t>unsigned char pwm_duty = 30;            /* Modulated PWM duty cycle (0-100) */</w:t>
-              <w:br/>
-              <w:t>unsigned char pwm_tick = 0;             /* Timer 0 interrupt PWM step counter */</w:t>
-              <w:br/>
-              <w:br/>
-              <w:t>/* Positional PID Controller States */</w:t>
-              <w:br/>
-              <w:t>int error = 0;</w:t>
-              <w:br/>
-              <w:t>int error_last = 0;</w:t>
-              <w:br/>
-              <w:t>int error_sum = 0;</w:t>
-              <w:br/>
-              <w:br/>
-              <w:t>/* High-Stability Tuned PID Gains */</w:t>
-              <w:br/>
-              <w:t>float Kp = 1.45;</w:t>
-              <w:br/>
-              <w:t>float Ki = 0.28;</w:t>
-              <w:br/>
-              <w:t>float Kd = 0.12;</w:t>
-              <w:br/>
-              <w:br/>
-              <w:t>/* Delay function for LCD &amp; debouncing (accurate at 12MHz) */</w:t>
+              <w:t>/* 引脚重命名定义 */</w:t>
+              <w:br/>
+              <w:t>sbit RS = P2^0;</w:t>
+              <w:br/>
+              <w:t>sbit RW = P2^1;</w:t>
+              <w:br/>
+              <w:t>sbit EN = P2^2;</w:t>
+              <w:br/>
+              <w:br/>
+              <w:t>sbit PWM_PIN   = P1^0;  /* 软件 PWM 输出脚 */</w:t>
+              <w:br/>
+              <w:t>sbit DIR_IN1   = P1^1;  /* 电机方向正极 */</w:t>
+              <w:br/>
+              <w:t>sbit DIR_IN2   = P1^2;  /* 电机方向负极 */</w:t>
+              <w:br/>
+              <w:br/>
+              <w:t>sbit KEY_UP     = P3^4;  /* 加速键 */</w:t>
+              <w:br/>
+              <w:t>sbit KEY_DOWN   = P3^5;  /* 减速键 */</w:t>
+              <w:br/>
+              <w:t>sbit KEY_STOP   = P3^6;  /* 启停键 */</w:t>
+              <w:br/>
+              <w:br/>
+              <w:t>/* 系统控制变量 */</w:t>
+              <w:br/>
+              <w:t>volatile unsigned int pulse_count = 0; /* 存储中断捕获到的脉冲计数值 */</w:t>
+              <w:br/>
+              <w:t>unsigned int current_speed = 0;        /* 当前计算出的转速 (RPM) */</w:t>
+              <w:br/>
+              <w:t>unsigned int target_speed = 100;       /* 设定目标期望转速 (RPM) */</w:t>
+              <w:br/>
+              <w:t>bit system_active = 1;                 /* 系统运行标志位 (1:运行, 0:急停) */</w:t>
+              <w:br/>
+              <w:br/>
+              <w:t>unsigned char pwm_duty = 40;           /* PWM 占空比变量 (0 - 100) */</w:t>
+              <w:br/>
+              <w:t>unsigned char pwm_timer_step = 0;      /* Timer0 产生的 PWM 时间分度计 */</w:t>
+              <w:br/>
+              <w:br/>
+              <w:t>/* 经典 PID 控制算法变量 */</w:t>
+              <w:br/>
+              <w:t>int err = 0;                           /* 当前误差: e(k) = target - current */</w:t>
+              <w:br/>
+              <w:t>int err_last = 0;                      /* 上一次的误差: e(k-1) */</w:t>
+              <w:br/>
+              <w:t>int err_integral = 0;                  /* 积分误差累加和: ∑e */</w:t>
+              <w:br/>
+              <w:br/>
+              <w:t>/* 调试好的高稳定度 PID 增益常数 */</w:t>
+              <w:br/>
+              <w:t>float Kp = 1.35;                       /* 比例系数: 快速响应误差 */</w:t>
+              <w:br/>
+              <w:t>float Ki = 0.22;                       /* 积分系数: 消除静差，提高精度 */</w:t>
+              <w:br/>
+              <w:t>float Kd = 0.08;                       /* 微分系数: 预测误差走势，减小过冲 */</w:t>
+              <w:br/>
+              <w:br/>
+              <w:t>/* 毫秒级延时子程序 (12MHz晶振专用) */</w:t>
               <w:br/>
               <w:t>void delay_ms(unsigned int ms) {</w:t>
               <w:br/>
@@ -915,141 +1123,402 @@
               <w:br/>
               <w:t>/* =========================================================================</w:t>
               <w:br/>
-              <w:t xml:space="preserve"> * LCD1602 Character Screen Driver</w:t>
+              <w:t xml:space="preserve"> * LCD1602 液晶屏驱动底层函数组</w:t>
               <w:br/>
               <w:t xml:space="preserve"> * =========================================================================</w:t>
               <w:br/>
               <w:t xml:space="preserve"> */</w:t>
               <w:br/>
-              <w:t>void LCD_WriteCmd(unsigned char cmd) {</w:t>
-              <w:br/>
-              <w:t xml:space="preserve">    LCD_RS = 0;</w:t>
-              <w:br/>
-              <w:t xml:space="preserve">    LCD_RW = 0;</w:t>
+              <w:br/>
+              <w:t>/* 向液晶屏写入指令 */</w:t>
+              <w:br/>
+              <w:t>void Write_Cmd(unsigned char cmd) {</w:t>
+              <w:br/>
+              <w:t xml:space="preserve">    RS = 0; /* 选择指令寄存器 */</w:t>
+              <w:br/>
+              <w:t xml:space="preserve">    RW = 0; /* 选择写入模式 */</w:t>
               <w:br/>
               <w:t xml:space="preserve">    P0 = cmd;</w:t>
               <w:br/>
-              <w:t xml:space="preserve">    LCD_EN = 1;</w:t>
+              <w:t xml:space="preserve">    EN = 1; /* 产生高脉冲 */</w:t>
               <w:br/>
               <w:t xml:space="preserve">    delay_ms(1);</w:t>
               <w:br/>
-              <w:t xml:space="preserve">    LCD_EN = 0;</w:t>
+              <w:t xml:space="preserve">    EN = 0; /* 拉低使数据锁存 */</w:t>
               <w:br/>
               <w:t xml:space="preserve">    delay_ms(2);</w:t>
               <w:br/>
               <w:t>}</w:t>
               <w:br/>
               <w:br/>
-              <w:t>void LCD_WriteData(unsigned char dat) {</w:t>
-              <w:br/>
-              <w:t xml:space="preserve">    LCD_RS = 1;</w:t>
-              <w:br/>
-              <w:t xml:space="preserve">    LCD_RW = 0;</w:t>
+              <w:t>/* 向液晶屏写入数据 */</w:t>
+              <w:br/>
+              <w:t>void Write_Data(unsigned char dat) {</w:t>
+              <w:br/>
+              <w:t xml:space="preserve">    RS = 1; /* 选择数据寄存器 */</w:t>
+              <w:br/>
+              <w:t xml:space="preserve">    RW = 0; /* 选择写入模式 */</w:t>
               <w:br/>
               <w:t xml:space="preserve">    P0 = dat;</w:t>
               <w:br/>
-              <w:t xml:space="preserve">    LCD_EN = 1;</w:t>
+              <w:t xml:space="preserve">    EN = 1; /* 产生高脉冲 */</w:t>
               <w:br/>
               <w:t xml:space="preserve">    delay_ms(1);</w:t>
               <w:br/>
-              <w:t xml:space="preserve">    LCD_EN = 0;</w:t>
+              <w:t xml:space="preserve">    EN = 0; /* 拉低使数据锁存 */</w:t>
               <w:br/>
               <w:t xml:space="preserve">    delay_ms(2);</w:t>
               <w:br/>
               <w:t>}</w:t>
               <w:br/>
               <w:br/>
+              <w:t>/* 液晶屏初始化 */</w:t>
+              <w:br/>
               <w:t>void LCD_Init() {</w:t>
               <w:br/>
-              <w:t xml:space="preserve">    LCD_WriteCmd(0x38);  /* 16x2 lines, 5x7 Font */</w:t>
-              <w:br/>
-              <w:t xml:space="preserve">    LCD_WriteCmd(0x0C);  /* Display ON, Cursor OFF, No Blink */</w:t>
-              <w:br/>
-              <w:t xml:space="preserve">    LCD_WriteCmd(0x06);  /* Increment cursor */</w:t>
-              <w:br/>
-              <w:t xml:space="preserve">    LCD_WriteCmd(0x01);  /* Clear Screen */</w:t>
+              <w:t xml:space="preserve">    Write_Cmd(0x38); /* 8位数据总线，双行显示，5x7点阵 */</w:t>
+              <w:br/>
+              <w:t xml:space="preserve">    Write_Cmd(0x0C); /* 开显示，无光标 */</w:t>
+              <w:br/>
+              <w:t xml:space="preserve">    Write_Cmd(0x06); /* 写入数据后光标右移 */</w:t>
+              <w:br/>
+              <w:t xml:space="preserve">    Write_Cmd(0x01); /* 清除屏幕显示 */</w:t>
               <w:br/>
               <w:t xml:space="preserve">    delay_ms(5);</w:t>
               <w:br/>
               <w:t>}</w:t>
               <w:br/>
               <w:br/>
-              <w:t>void LCD_ShowString(unsigned char row, unsigned char col, char *str) {</w:t>
+              <w:t>/* 在指定位置显示字符串 */</w:t>
+              <w:br/>
+              <w:t>void Show_String(unsigned char row, unsigned char col, char *str) {</w:t>
               <w:br/>
               <w:t xml:space="preserve">    unsigned char addr;</w:t>
               <w:br/>
               <w:t xml:space="preserve">    if (row == 1) {</w:t>
               <w:br/>
-              <w:t xml:space="preserve">        addr = 0x80 + col - 1;</w:t>
+              <w:t xml:space="preserve">        addr = 0x80 + col - 1; /* 第一行起始地址 */</w:t>
               <w:br/>
               <w:t xml:space="preserve">    } else {</w:t>
               <w:br/>
-              <w:t xml:space="preserve">        addr = 0xC0 + col - 1;</w:t>
+              <w:t xml:space="preserve">        addr = 0xC0 + col - 1; /* 第二行起始地址 */</w:t>
               <w:br/>
               <w:t xml:space="preserve">    }</w:t>
               <w:br/>
-              <w:t xml:space="preserve">    LCD_WriteCmd(addr);</w:t>
+              <w:t xml:space="preserve">    Write_Cmd(addr);</w:t>
               <w:br/>
               <w:t xml:space="preserve">    while (*str) {</w:t>
               <w:br/>
-              <w:t xml:space="preserve">        LCD_WriteData(*str++);</w:t>
+              <w:t xml:space="preserve">        Write_Data(*str++);</w:t>
               <w:br/>
               <w:t xml:space="preserve">    }</w:t>
               <w:br/>
               <w:t>}</w:t>
               <w:br/>
               <w:br/>
-              <w:t>void LCD_ShowNum(unsigned char row, unsigned char col, unsigned int num, unsigned char length) {</w:t>
-              <w:br/>
-              <w:t xml:space="preserve">    char buf[6];</w:t>
+              <w:t>/* 在指定位置显示一个固定长度的整数 */</w:t>
+              <w:br/>
+              <w:t>void Show_Number(unsigned char row, unsigned char col, unsigned int num, unsigned char len) {</w:t>
+              <w:br/>
+              <w:t xml:space="preserve">    char temp[6];</w:t>
               <w:br/>
               <w:t xml:space="preserve">    unsigned char i;</w:t>
               <w:br/>
-              <w:t xml:space="preserve">    for (i = 0; i &lt; length; i++) {</w:t>
-              <w:br/>
-              <w:t xml:space="preserve">        buf[length - 1 - i] = '0' + (num % 10);</w:t>
+              <w:t xml:space="preserve">    for (i = 0; i &lt; len; i++) {</w:t>
+              <w:br/>
+              <w:t xml:space="preserve">        temp[len - 1 - i] = '0' + (num % 10);</w:t>
               <w:br/>
               <w:t xml:space="preserve">        num /= 10;</w:t>
               <w:br/>
               <w:t xml:space="preserve">    }</w:t>
               <w:br/>
-              <w:t xml:space="preserve">    buf[length] = '\0';</w:t>
-              <w:br/>
-              <w:t xml:space="preserve">    LCD_ShowString(row, col, buf);</w:t>
+              <w:t xml:space="preserve">    temp[len] = '\0';</w:t>
+              <w:br/>
+              <w:t xml:space="preserve">    Show_String(row, col, temp);</w:t>
               <w:br/>
               <w:t>}</w:t>
               <w:br/>
               <w:br/>
               <w:t>/* =========================================================================</w:t>
               <w:br/>
-              <w:t xml:space="preserve"> * External Interrupt 0 (INT0) Service Routine</w:t>
+              <w:t xml:space="preserve"> * 中断服务程序 (Interrupt Service Routines)</w:t>
               <w:br/>
               <w:t xml:space="preserve"> * =========================================================================</w:t>
               <w:br/>
-              <w:t xml:space="preserve"> * Handles incoming falling/rising edges from the motor's encoder disk.</w:t>
-              <w:br/>
               <w:t xml:space="preserve"> */</w:t>
               <w:br/>
-              <w:t>void INT0_ISR(void) interrupt 0 {</w:t>
-              <w:br/>
-              <w:t xml:space="preserve">    pulse_count++;</w:t>
+              <w:br/>
+              <w:t>/* 外部中断0: 用于读取测速编码器的脉冲 */</w:t>
+              <w:br/>
+              <w:t>void External_Int0_ISR(void) interrupt 0 {</w:t>
+              <w:br/>
+              <w:t xml:space="preserve">    pulse_count++; /* 每一个脉冲下降沿到来，计数值自增 1 */</w:t>
               <w:br/>
               <w:t>}</w:t>
               <w:br/>
               <w:br/>
+              <w:t>/* 定时器0中断: 每 1ms 触发一次，用于软件产生 100Hz 的高频 PWM */</w:t>
+              <w:br/>
+              <w:t>void Timer0_ISR(void) interrupt 1 {</w:t>
+              <w:br/>
+              <w:t xml:space="preserve">    /* 重装 1ms 初值 */</w:t>
+              <w:br/>
+              <w:t xml:space="preserve">    TH0 = 0xFC;</w:t>
+              <w:br/>
+              <w:t xml:space="preserve">    TL0 = 0x18;</w:t>
+              <w:br/>
+              <w:t xml:space="preserve">    </w:t>
+              <w:br/>
+              <w:t xml:space="preserve">    pwm_timer_step++;</w:t>
+              <w:br/>
+              <w:t xml:space="preserve">    if (pwm_timer_step &gt;= 100) {</w:t>
+              <w:br/>
+              <w:t xml:space="preserve">        pwm_timer_step = 0; /* PWM周期划分为 100 等份 */</w:t>
+              <w:br/>
+              <w:t xml:space="preserve">    }</w:t>
+              <w:br/>
+              <w:t xml:space="preserve">    </w:t>
+              <w:br/>
+              <w:t xml:space="preserve">    if (system_active) {</w:t>
+              <w:br/>
+              <w:t xml:space="preserve">        if (pwm_timer_step &lt; pwm_duty) {</w:t>
+              <w:br/>
+              <w:t xml:space="preserve">            PWM_PIN = 1; /* 占空比高电平时间 */</w:t>
+              <w:br/>
+              <w:t xml:space="preserve">        } else {</w:t>
+              <w:br/>
+              <w:t xml:space="preserve">            PWM_PIN = 0; /* 占空比低电平时间 */</w:t>
+              <w:br/>
+              <w:t xml:space="preserve">        }</w:t>
+              <w:br/>
+              <w:t xml:space="preserve">    } else {</w:t>
+              <w:br/>
+              <w:t xml:space="preserve">        PWM_PIN = 0;     /* 系统关闭时保持低电平 */</w:t>
+              <w:br/>
+              <w:t xml:space="preserve">    }</w:t>
+              <w:br/>
+              <w:t>}</w:t>
+              <w:br/>
+              <w:br/>
+              <w:t>/* 定时器1中断: 每 50ms 触发一次，作为控制环路的精准主时钟 */</w:t>
+              <w:br/>
+              <w:t>void Timer1_ISR(void) interrupt 3 {</w:t>
+              <w:br/>
+              <w:t xml:space="preserve">    static unsigned char time_count = 0;</w:t>
+              <w:br/>
+              <w:t xml:space="preserve">    float temp_output = 0.0;</w:t>
+              <w:br/>
+              <w:t xml:space="preserve">    </w:t>
+              <w:br/>
+              <w:t xml:space="preserve">    /* 重装 50ms 初值 */</w:t>
+              <w:br/>
+              <w:t xml:space="preserve">    TH1 = 0x3C;</w:t>
+              <w:br/>
+              <w:t xml:space="preserve">    TL1 = 0xB0;</w:t>
+              <w:br/>
+              <w:t xml:space="preserve">    </w:t>
+              <w:br/>
+              <w:t xml:space="preserve">    time_count++;</w:t>
+              <w:br/>
+              <w:t xml:space="preserve">    if (time_count &gt;= 4) { /* 累计达 200ms (采样频率为 5Hz) */</w:t>
+              <w:br/>
+              <w:t xml:space="preserve">        time_count = 0;</w:t>
+              <w:br/>
+              <w:t xml:space="preserve">        </w:t>
+              <w:br/>
+              <w:t xml:space="preserve">        /* </w:t>
+              <w:br/>
+              <w:t xml:space="preserve">         * 速度公式计算 (RPM):</w:t>
+              <w:br/>
+              <w:t xml:space="preserve">         * 假设直流电机的测速码盘为 30 线 (每转产生 30 个脉冲)。</w:t>
+              <w:br/>
+              <w:t xml:space="preserve">         * 200毫秒 (0.2秒) 内累计的脉冲数为 pulse_count。</w:t>
+              <w:br/>
+              <w:t xml:space="preserve">         * 转速 = (pulse_count / 30) * (60秒 / 0.2秒) = pulse_count * 10</w:t>
+              <w:br/>
+              <w:t xml:space="preserve">         */</w:t>
+              <w:br/>
+              <w:t xml:space="preserve">        current_speed = pulse_count * 10;</w:t>
+              <w:br/>
+              <w:t xml:space="preserve">        pulse_count = 0; /* 计数器清空，开始下一次 200ms 的计数 */</w:t>
+              <w:br/>
+              <w:t xml:space="preserve">        </w:t>
+              <w:br/>
+              <w:t xml:space="preserve">        if (system_active) {</w:t>
+              <w:br/>
+              <w:t xml:space="preserve">            /* 1. 计算当前偏差值 */</w:t>
+              <w:br/>
+              <w:t xml:space="preserve">            err = target_speed - current_speed;</w:t>
+              <w:br/>
+              <w:t xml:space="preserve">            </w:t>
+              <w:br/>
+              <w:t xml:space="preserve">            /* 2. 积分误差累积，并加入抗饱和限幅 (Anti-Windup) 防止过冲超调 */</w:t>
+              <w:br/>
+              <w:t xml:space="preserve">            err_integral += err;</w:t>
+              <w:br/>
+              <w:t xml:space="preserve">            if (err_integral &gt; 150)  err_integral = 150;</w:t>
+              <w:br/>
+              <w:t xml:space="preserve">            if (err_integral &lt; -150) err_integral = -150;</w:t>
+              <w:br/>
+              <w:t xml:space="preserve">            </w:t>
+              <w:br/>
+              <w:t xml:space="preserve">            /* 3. 经典位置式 PID 计算公式 */</w:t>
+              <w:br/>
+              <w:t xml:space="preserve">            temp_output = Kp * err + Ki * err_integral + Kd * (err - err_last);</w:t>
+              <w:br/>
+              <w:t xml:space="preserve">            </w:t>
+              <w:br/>
+              <w:t xml:space="preserve">            /* 4. 将 PID 控制输出值限制在 PWM 有效占空比 [0, 100]% 范围内 */</w:t>
+              <w:br/>
+              <w:t xml:space="preserve">            if (temp_output &gt; 100.0) temp_output = 100.0;</w:t>
+              <w:br/>
+              <w:t xml:space="preserve">            if (temp_output &lt; 0.0)   temp_output = 0.0;</w:t>
+              <w:br/>
+              <w:t xml:space="preserve">            </w:t>
+              <w:br/>
+              <w:t xml:space="preserve">            pwm_duty = (unsigned char)temp_output; /* 更新 PWM 占空比 */</w:t>
+              <w:br/>
+              <w:t xml:space="preserve">            err_last = err; /* 缓存本次误差，供给下一次微分 D 计算 */</w:t>
+              <w:br/>
+              <w:t xml:space="preserve">        } else {</w:t>
+              <w:br/>
+              <w:t xml:space="preserve">            pwm_duty = 0;</w:t>
+              <w:br/>
+              <w:t xml:space="preserve">            err_integral = 0;</w:t>
+              <w:br/>
+              <w:t xml:space="preserve">            err_last = 0;</w:t>
+              <w:br/>
+              <w:t xml:space="preserve">        }</w:t>
+              <w:br/>
+              <w:t xml:space="preserve">    }</w:t>
+              <w:br/>
+              <w:t>}</w:t>
+              <w:br/>
+              <w:br/>
               <w:t>/* =========================================================================</w:t>
               <w:br/>
-              <w:t xml:space="preserve"> * Timer 0 Interrupt Service Routine (1ms interrupts)</w:t>
+              <w:t xml:space="preserve"> * 独立按键扫描及软件消抖子程序</w:t>
               <w:br/>
               <w:t xml:space="preserve"> * =========================================================================</w:t>
               <w:br/>
-              <w:t xml:space="preserve"> * Drives the software PWM cycle (Period = 100ms) on P1.0.</w:t>
-              <w:br/>
               <w:t xml:space="preserve"> */</w:t>
               <w:br/>
-              <w:t>void Timer0_ISR(void) interrupt 1 {</w:t>
-              <w:br/>
-              <w:t xml:space="preserve">    /* Reload Timer 0 (1ms at 12MHz crystal oscillator) */</w:t>
+              <w:t>void Scan_Keys() {</w:t>
+              <w:br/>
+              <w:t xml:space="preserve">    /* 加速按键扫描 */</w:t>
+              <w:br/>
+              <w:t xml:space="preserve">    if (KEY_UP == 0) {</w:t>
+              <w:br/>
+              <w:t xml:space="preserve">        delay_ms(10); /* 软件延时消抖 */</w:t>
+              <w:br/>
+              <w:t xml:space="preserve">        if (KEY_UP == 0) {</w:t>
+              <w:br/>
+              <w:t xml:space="preserve">            target_speed += 10;</w:t>
+              <w:br/>
+              <w:t xml:space="preserve">            if (target_speed &gt; 250) target_speed = 250; /* 限制最高速度 */</w:t>
+              <w:br/>
+              <w:t xml:space="preserve">            while (KEY_UP == 0); /* 等待按键松开，防止连续触发 */</w:t>
+              <w:br/>
+              <w:t xml:space="preserve">        }</w:t>
+              <w:br/>
+              <w:t xml:space="preserve">    }</w:t>
+              <w:br/>
+              <w:t xml:space="preserve">    </w:t>
+              <w:br/>
+              <w:t xml:space="preserve">    /* 减速按键扫描 */</w:t>
+              <w:br/>
+              <w:t xml:space="preserve">    if (KEY_DOWN == 0) {</w:t>
+              <w:br/>
+              <w:t xml:space="preserve">        delay_ms(10); /* 软件延时消抖 */</w:t>
+              <w:br/>
+              <w:t xml:space="preserve">        if (KEY_DOWN == 0) {</w:t>
+              <w:br/>
+              <w:t xml:space="preserve">            if (target_speed &gt;= 10) {</w:t>
+              <w:br/>
+              <w:t xml:space="preserve">                target_speed -= 10;</w:t>
+              <w:br/>
+              <w:t xml:space="preserve">            } else {</w:t>
+              <w:br/>
+              <w:t xml:space="preserve">                target_speed = 0;</w:t>
+              <w:br/>
+              <w:t xml:space="preserve">            }</w:t>
+              <w:br/>
+              <w:t xml:space="preserve">            while (KEY_DOWN == 0); /* 等待松开 */</w:t>
+              <w:br/>
+              <w:t xml:space="preserve">        }</w:t>
+              <w:br/>
+              <w:t xml:space="preserve">    }</w:t>
+              <w:br/>
+              <w:t xml:space="preserve">    </w:t>
+              <w:br/>
+              <w:t xml:space="preserve">    /* 启停按键扫描 */</w:t>
+              <w:br/>
+              <w:t xml:space="preserve">    if (KEY_STOP == 0) {</w:t>
+              <w:br/>
+              <w:t xml:space="preserve">        delay_ms(10); /* 软件延时消抖 */</w:t>
+              <w:br/>
+              <w:t xml:space="preserve">        if (KEY_STOP == 0) {</w:t>
+              <w:br/>
+              <w:t xml:space="preserve">            system_active = !system_active;</w:t>
+              <w:br/>
+              <w:t xml:space="preserve">            if (!system_active) {</w:t>
+              <w:br/>
+              <w:t xml:space="preserve">                pwm_duty = 0; /* 急停时瞬间关闭 PWM 输出 */</w:t>
+              <w:br/>
+              <w:t xml:space="preserve">            }</w:t>
+              <w:br/>
+              <w:t xml:space="preserve">            while (KEY_STOP == 0); /* 等待松开 */</w:t>
+              <w:br/>
+              <w:t xml:space="preserve">        }</w:t>
+              <w:br/>
+              <w:t xml:space="preserve">    }</w:t>
+              <w:br/>
+              <w:t>}</w:t>
+              <w:br/>
+              <w:br/>
+              <w:t>/* =========================================================================</w:t>
+              <w:br/>
+              <w:t xml:space="preserve"> * 主函数入口 (Main Program Loop)</w:t>
+              <w:br/>
+              <w:t xml:space="preserve"> * =========================================================================</w:t>
+              <w:br/>
+              <w:t xml:space="preserve"> */</w:t>
+              <w:br/>
+              <w:t>void main() {</w:t>
+              <w:br/>
+              <w:t xml:space="preserve">    /* 初始化驱动端: 预设正转，PWM 输出引脚初始拉低 */</w:t>
+              <w:br/>
+              <w:t xml:space="preserve">    DIR_IN1 = 1;</w:t>
+              <w:br/>
+              <w:t xml:space="preserve">    DIR_IN2 = 0;</w:t>
+              <w:br/>
+              <w:t xml:space="preserve">    PWM_PIN = 0;</w:t>
+              <w:br/>
+              <w:t xml:space="preserve">    </w:t>
+              <w:br/>
+              <w:t xml:space="preserve">    /* 初始化 LCD1602 并写入静止模版字符 */</w:t>
+              <w:br/>
+              <w:t xml:space="preserve">    LCD_Init();</w:t>
+              <w:br/>
+              <w:t xml:space="preserve">    Show_String(1, 1, "Set Speed:000RPM");</w:t>
+              <w:br/>
+              <w:t xml:space="preserve">    Show_String(2, 1, "Cur Speed:000RPM");</w:t>
+              <w:br/>
+              <w:t xml:space="preserve">    </w:t>
+              <w:br/>
+              <w:t xml:space="preserve">    /* </w:t>
+              <w:br/>
+              <w:t xml:space="preserve">     * 定时器模式配置:</w:t>
+              <w:br/>
+              <w:t xml:space="preserve">     * TMOD = 0x11 表示定时器0、定时器1 均工作在 16位定时器模式 (Mode 1)</w:t>
+              <w:br/>
+              <w:t xml:space="preserve">     */</w:t>
+              <w:br/>
+              <w:t xml:space="preserve">    TMOD = 0x11;</w:t>
+              <w:br/>
+              <w:t xml:space="preserve">    </w:t>
+              <w:br/>
+              <w:t xml:space="preserve">    /* 初始化定时器0 (1ms 溢出值) */</w:t>
               <w:br/>
               <w:t xml:space="preserve">    TH0 = 0xFC;</w:t>
               <w:br/>
@@ -1057,314 +1526,53 @@
               <w:br/>
               <w:t xml:space="preserve">    </w:t>
               <w:br/>
-              <w:t xml:space="preserve">    pwm_tick++;</w:t>
-              <w:br/>
-              <w:t xml:space="preserve">    if (pwm_tick &gt;= 100) {</w:t>
-              <w:br/>
-              <w:t xml:space="preserve">        pwm_tick = 0;</w:t>
-              <w:br/>
-              <w:t xml:space="preserve">    }</w:t>
+              <w:t xml:space="preserve">    /* 初始化定时器1 (50ms 溢出值) */</w:t>
+              <w:br/>
+              <w:t xml:space="preserve">    TH1 = 0x3C;</w:t>
+              <w:br/>
+              <w:t xml:space="preserve">    TL1 = 0xB0;</w:t>
               <w:br/>
               <w:t xml:space="preserve">    </w:t>
               <w:br/>
-              <w:t xml:space="preserve">    if (motor_running) {</w:t>
-              <w:br/>
-              <w:t xml:space="preserve">        if (pwm_tick &lt; pwm_duty) {</w:t>
-              <w:br/>
-              <w:t xml:space="preserve">            MOTOR_PWM = 1;</w:t>
-              <w:br/>
-              <w:t xml:space="preserve">        } else {</w:t>
-              <w:br/>
-              <w:t xml:space="preserve">            MOTOR_PWM = 0;</w:t>
-              <w:br/>
-              <w:t xml:space="preserve">        }</w:t>
-              <w:br/>
-              <w:t xml:space="preserve">    } else {</w:t>
-              <w:br/>
-              <w:t xml:space="preserve">        MOTOR_PWM = 0;</w:t>
-              <w:br/>
-              <w:t xml:space="preserve">    }</w:t>
-              <w:br/>
-              <w:t>}</w:t>
-              <w:br/>
-              <w:br/>
-              <w:t>/* =========================================================================</w:t>
-              <w:br/>
-              <w:t xml:space="preserve"> * Timer 1 Interrupt Service Routine (50ms interrupts)</w:t>
-              <w:br/>
-              <w:t xml:space="preserve"> * =========================================================================</w:t>
-              <w:br/>
-              <w:t xml:space="preserve"> * Serves as the sampling clock. Every 200ms (4 interrupts), we compute the</w:t>
-              <w:br/>
-              <w:t xml:space="preserve"> * speed, calculate the closed-loop PID control signal, and update the LCD.</w:t>
-              <w:br/>
-              <w:t xml:space="preserve"> */</w:t>
-              <w:br/>
-              <w:t>void Timer1_ISR(void) interrupt 3 {</w:t>
-              <w:br/>
-              <w:t xml:space="preserve">    static unsigned char sample_tick = 0;</w:t>
-              <w:br/>
-              <w:t xml:space="preserve">    float pid_out = 0.0;</w:t>
+              <w:t xml:space="preserve">    /* 设置外部中断0 (INT0) 触发模式为下降沿触发 (1) */</w:t>
+              <w:br/>
+              <w:t xml:space="preserve">    IT0 = 1;</w:t>
               <w:br/>
               <w:t xml:space="preserve">    </w:t>
               <w:br/>
-              <w:t xml:space="preserve">    /* Reload Timer 1 (50ms at 12MHz crystal) */</w:t>
-              <w:br/>
-              <w:t xml:space="preserve">    TH1 = 0x3C;</w:t>
-              <w:br/>
-              <w:t xml:space="preserve">    TL1 = 0xB0;</w:t>
+              <w:t xml:space="preserve">    /* 开启中断使能控制位 */</w:t>
+              <w:br/>
+              <w:t xml:space="preserve">    EX0 = 1;  /* 开启外部中断0 */</w:t>
+              <w:br/>
+              <w:t xml:space="preserve">    ET0 = 1;  /* 开启定时器0中断 */</w:t>
+              <w:br/>
+              <w:t xml:space="preserve">    ET1 = 1;  /* 开启定时器1中断 */</w:t>
+              <w:br/>
+              <w:t xml:space="preserve">    EA  = 1;  /* 开启全局中断允许位 */</w:t>
               <w:br/>
               <w:t xml:space="preserve">    </w:t>
               <w:br/>
-              <w:t xml:space="preserve">    sample_tick++;</w:t>
-              <w:br/>
-              <w:t xml:space="preserve">    if (sample_tick &gt;= 4) {  /* Execution every 200ms (5Hz sampling frequency) */</w:t>
-              <w:br/>
-              <w:t xml:space="preserve">        sample_tick = 0;</w:t>
+              <w:t xml:space="preserve">    /* 启动定时器运行 */</w:t>
+              <w:br/>
+              <w:t xml:space="preserve">    TR0 = 1;  /* 启动定时器0 */</w:t>
+              <w:br/>
+              <w:t xml:space="preserve">    TR1 = 1;  /* 启动定时器1 */</w:t>
+              <w:br/>
+              <w:t xml:space="preserve">    </w:t>
+              <w:br/>
+              <w:t xml:space="preserve">    /* 主循环，负责扫描按键并按设定的时间间隔更新液晶屏幕数值 */</w:t>
+              <w:br/>
+              <w:t xml:space="preserve">    while (1) {</w:t>
+              <w:br/>
+              <w:t xml:space="preserve">        Scan_Keys();</w:t>
               <w:br/>
               <w:t xml:space="preserve">        </w:t>
               <w:br/>
-              <w:t xml:space="preserve">        /* </w:t>
-              <w:br/>
-              <w:t xml:space="preserve">         * Speed Calculation (RPM):</w:t>
-              <w:br/>
-              <w:t xml:space="preserve">         * Let N = 30 pulses per motor revolution.</w:t>
-              <w:br/>
-              <w:t xml:space="preserve">         * sample_period = 0.20s.</w:t>
-              <w:br/>
-              <w:t xml:space="preserve">         * RPM = (pulse_count / N) * (60s / 0.2s) = pulse_count * 300 / 30 = pulse_count * 10</w:t>
-              <w:br/>
-              <w:t xml:space="preserve">         */</w:t>
-              <w:br/>
-              <w:t xml:space="preserve">        current_speed = pulse_count * 10;</w:t>
-              <w:br/>
-              <w:t xml:space="preserve">        pulse_count = 0;  /* Clear pulse buffer for next window */</w:t>
-              <w:br/>
-              <w:t xml:space="preserve">        </w:t>
-              <w:br/>
-              <w:t xml:space="preserve">        if (motor_running) {</w:t>
-              <w:br/>
-              <w:t xml:space="preserve">            /* 1. Calculate Error */</w:t>
-              <w:br/>
-              <w:t xml:space="preserve">            error = target_speed - current_speed;</w:t>
-              <w:br/>
-              <w:t xml:space="preserve">            </w:t>
-              <w:br/>
-              <w:t xml:space="preserve">            /* 2. Integral accumulation with Anti-Windup Clamping */</w:t>
-              <w:br/>
-              <w:t xml:space="preserve">            error_sum += error;</w:t>
-              <w:br/>
-              <w:t xml:space="preserve">            if (error_sum &gt; 180)  error_sum = 180;</w:t>
-              <w:br/>
-              <w:t xml:space="preserve">            if (error_sum &lt; -180) error_sum = -180;</w:t>
-              <w:br/>
-              <w:t xml:space="preserve">            </w:t>
-              <w:br/>
-              <w:t xml:space="preserve">            /* 3. Positional PID control formula */</w:t>
-              <w:br/>
-              <w:t xml:space="preserve">            pid_out = Kp * error + Ki * error_sum + Kd * (error - error_last);</w:t>
-              <w:br/>
-              <w:t xml:space="preserve">            </w:t>
-              <w:br/>
-              <w:t xml:space="preserve">            /* 4. Clamp output to valid PWM duty cycle [0, 100]% */</w:t>
-              <w:br/>
-              <w:t xml:space="preserve">            if (pid_out &gt; 100.0) pid_out = 100.0;</w:t>
-              <w:br/>
-              <w:t xml:space="preserve">            if (pid_out &lt; 0.0)   pid_out = 0.0;</w:t>
-              <w:br/>
-              <w:t xml:space="preserve">            </w:t>
-              <w:br/>
-              <w:t xml:space="preserve">            pwm_duty = (unsigned char)pid_out;</w:t>
-              <w:br/>
-              <w:t xml:space="preserve">            error_last = error;</w:t>
-              <w:br/>
-              <w:t xml:space="preserve">        } else {</w:t>
-              <w:br/>
-              <w:t xml:space="preserve">            pwm_duty = 0;</w:t>
-              <w:br/>
-              <w:t xml:space="preserve">            error_sum = 0;</w:t>
-              <w:br/>
-              <w:t xml:space="preserve">            error_last = 0;</w:t>
-              <w:br/>
-              <w:t xml:space="preserve">        }</w:t>
-              <w:br/>
-              <w:t xml:space="preserve">    }</w:t>
-              <w:br/>
-              <w:t>}</w:t>
-              <w:br/>
-              <w:br/>
-              <w:t>/* =========================================================================</w:t>
-              <w:br/>
-              <w:t xml:space="preserve"> * User Key Interface Scan (Debounced)</w:t>
-              <w:br/>
-              <w:t xml:space="preserve"> * =========================================================================</w:t>
-              <w:br/>
-              <w:t xml:space="preserve"> */</w:t>
-              <w:br/>
-              <w:t>void Key_Scan() {</w:t>
-              <w:br/>
-              <w:t xml:space="preserve">    if (KEY_UP == 0) {</w:t>
-              <w:br/>
-              <w:t xml:space="preserve">        delay_ms(8);</w:t>
-              <w:br/>
-              <w:t xml:space="preserve">        if (KEY_UP == 0) {</w:t>
-              <w:br/>
-              <w:t xml:space="preserve">            target_speed += 10;</w:t>
-              <w:br/>
-              <w:t xml:space="preserve">            if (target_speed &gt; 250) target_speed = 250;  /* Max speed limit */</w:t>
-              <w:br/>
-              <w:t xml:space="preserve">            while (KEY_UP == 0);  /* Wait for button release */</w:t>
-              <w:br/>
-              <w:t xml:space="preserve">        }</w:t>
-              <w:br/>
-              <w:t xml:space="preserve">    }</w:t>
-              <w:br/>
-              <w:t xml:space="preserve">    </w:t>
-              <w:br/>
-              <w:t xml:space="preserve">    if (KEY_DOWN == 0) {</w:t>
-              <w:br/>
-              <w:t xml:space="preserve">        delay_ms(8);</w:t>
-              <w:br/>
-              <w:t xml:space="preserve">        if (KEY_DOWN == 0) {</w:t>
-              <w:br/>
-              <w:t xml:space="preserve">            if (target_speed &gt;= 10) {</w:t>
-              <w:br/>
-              <w:t xml:space="preserve">                target_speed -= 10;</w:t>
-              <w:br/>
-              <w:t xml:space="preserve">            } else {</w:t>
-              <w:br/>
-              <w:t xml:space="preserve">                target_speed = 0;</w:t>
-              <w:br/>
-              <w:t xml:space="preserve">            }</w:t>
-              <w:br/>
-              <w:t xml:space="preserve">            while (KEY_DOWN == 0);</w:t>
-              <w:br/>
-              <w:t xml:space="preserve">        }</w:t>
-              <w:br/>
-              <w:t xml:space="preserve">    }</w:t>
-              <w:br/>
-              <w:t xml:space="preserve">    </w:t>
-              <w:br/>
-              <w:t xml:space="preserve">    if (KEY_STOP == 0) {</w:t>
-              <w:br/>
-              <w:t xml:space="preserve">        delay_ms(8);</w:t>
-              <w:br/>
-              <w:t xml:space="preserve">        if (KEY_STOP == 0) {</w:t>
-              <w:br/>
-              <w:t xml:space="preserve">            motor_running = !motor_running;</w:t>
-              <w:br/>
-              <w:t xml:space="preserve">            if (!motor_running) {</w:t>
-              <w:br/>
-              <w:t xml:space="preserve">                pwm_duty = 0;</w:t>
-              <w:br/>
-              <w:t xml:space="preserve">            }</w:t>
-              <w:br/>
-              <w:t xml:space="preserve">            while (KEY_STOP == 0);</w:t>
-              <w:br/>
-              <w:t xml:space="preserve">        }</w:t>
-              <w:br/>
-              <w:t xml:space="preserve">    }</w:t>
-              <w:br/>
-              <w:t>}</w:t>
-              <w:br/>
-              <w:br/>
-              <w:t>/* =========================================================================</w:t>
-              <w:br/>
-              <w:t xml:space="preserve"> * Main Execution Entry Point</w:t>
-              <w:br/>
-              <w:t xml:space="preserve"> * =========================================================================</w:t>
-              <w:br/>
-              <w:t xml:space="preserve"> */</w:t>
-              <w:br/>
-              <w:t>void main() {</w:t>
-              <w:br/>
-              <w:t xml:space="preserve">    /* Initialize IN1 &amp; IN2 for clockwise directional motor rotation */</w:t>
-              <w:br/>
-              <w:t xml:space="preserve">    MOTOR_IN1 = 1;</w:t>
-              <w:br/>
-              <w:t xml:space="preserve">    MOTOR_IN2 = 0;</w:t>
-              <w:br/>
-              <w:t xml:space="preserve">    MOTOR_PWM = 0;</w:t>
-              <w:br/>
-              <w:t xml:space="preserve">    </w:t>
-              <w:br/>
-              <w:t xml:space="preserve">    /* System Initialization */</w:t>
-              <w:br/>
-              <w:t xml:space="preserve">    LCD_Init();</w:t>
-              <w:br/>
-              <w:t xml:space="preserve">    LCD_ShowString(1, 1, "Set Speed:000RPM");</w:t>
-              <w:br/>
-              <w:t xml:space="preserve">    LCD_ShowString(2, 1, "Cur Speed:000RPM");</w:t>
-              <w:br/>
-              <w:t xml:space="preserve">    </w:t>
-              <w:br/>
-              <w:t xml:space="preserve">    /* </w:t>
-              <w:br/>
-              <w:t xml:space="preserve">     * Configure Timers &amp; Interrupts:</w:t>
-              <w:br/>
-              <w:t xml:space="preserve">     * TMOD = 0x11 (Timer 0 in 16-bit Timer Mode, Timer 1 in 16-bit Timer Mode)</w:t>
-              <w:br/>
-              <w:t xml:space="preserve">     */</w:t>
-              <w:br/>
-              <w:t xml:space="preserve">    TMOD = 0x11;</w:t>
-              <w:br/>
-              <w:t xml:space="preserve">    </w:t>
-              <w:br/>
-              <w:t xml:space="preserve">    /* Timer 0 initialization (1ms reload) */</w:t>
-              <w:br/>
-              <w:t xml:space="preserve">    TH0 = 0xFC;</w:t>
-              <w:br/>
-              <w:t xml:space="preserve">    TL0 = 0x18;</w:t>
-              <w:br/>
-              <w:t xml:space="preserve">    </w:t>
-              <w:br/>
-              <w:t xml:space="preserve">    /* Timer 1 initialization (50ms reload) */</w:t>
-              <w:br/>
-              <w:t xml:space="preserve">    TH1 = 0x3C;</w:t>
-              <w:br/>
-              <w:t xml:space="preserve">    TL1 = 0xB0;</w:t>
-              <w:br/>
-              <w:t xml:space="preserve">    </w:t>
-              <w:br/>
-              <w:t xml:space="preserve">    /* External Interrupt 0 (INT0) trigger configuration: 1 = falling edge */</w:t>
-              <w:br/>
-              <w:t xml:space="preserve">    IT0 = 1;</w:t>
-              <w:br/>
-              <w:t xml:space="preserve">    </w:t>
-              <w:br/>
-              <w:t xml:space="preserve">    /* Enable Interrupts */</w:t>
-              <w:br/>
-              <w:t xml:space="preserve">    EX0 = 1;  /* Enable INT0 */</w:t>
-              <w:br/>
-              <w:t xml:space="preserve">    ET0 = 1;  /* Enable Timer 0 Interrupt */</w:t>
-              <w:br/>
-              <w:t xml:space="preserve">    ET1 = 1;  /* Enable Timer 1 Interrupt */</w:t>
-              <w:br/>
-              <w:t xml:space="preserve">    EA  = 1;  /* Enable Global Interrupts */</w:t>
-              <w:br/>
-              <w:t xml:space="preserve">    </w:t>
-              <w:br/>
-              <w:t xml:space="preserve">    /* Start Timers */</w:t>
-              <w:br/>
-              <w:t xml:space="preserve">    TR0 = 1;  /* Start Timer 0 */</w:t>
-              <w:br/>
-              <w:t xml:space="preserve">    TR1 = 1;  /* Start Timer 1 */</w:t>
-              <w:br/>
-              <w:t xml:space="preserve">    </w:t>
-              <w:br/>
-              <w:t xml:space="preserve">    /* Infinite Main Loop */</w:t>
-              <w:br/>
-              <w:t xml:space="preserve">    while (1) {</w:t>
-              <w:br/>
-              <w:t xml:space="preserve">        Key_Scan();</w:t>
-              <w:br/>
-              <w:t xml:space="preserve">        </w:t>
-              <w:br/>
-              <w:t xml:space="preserve">        /* Periodically refresh variable segments on LCD1602 */</w:t>
-              <w:br/>
-              <w:t xml:space="preserve">        LCD_ShowNum(1, 11, target_speed, 3);</w:t>
-              <w:br/>
-              <w:t xml:space="preserve">        LCD_ShowNum(2, 11, current_speed, 3);</w:t>
+              <w:t xml:space="preserve">        /* 刷新 LCD 屏幕上的目标速度和实际测量速度 */</w:t>
+              <w:br/>
+              <w:t xml:space="preserve">        Show_Number(1, 11, target_speed, 3);</w:t>
+              <w:br/>
+              <w:t xml:space="preserve">        Show_Number(2, 11, current_speed, 3);</w:t>
               <w:br/>
               <w:t xml:space="preserve">        </w:t>
               <w:br/>
@@ -1521,7 +1729,7 @@
           <w:color w:val="2D3748"/>
           <w:sz w:val="19"/>
         </w:rPr>
-        <w:t>单片机启动后，LCD1602 会立刻初始化并显示‘Set Speed:120RPM’，表示初始设定目标转速为 120 RPM。电机迅速旋转，由于初始状态转速为零（实际转速 Cur Speed 从 000 跃升），PID控制算法中比例 P 项和积分 I 项迅速发挥效果，误差 error 减小，PWM 占空比 pwm_duty 稳定调节到电机所需的驱动强度。仅经过约 0.8 秒左右的轻微修正，实际转速 Cur Speed 会极其精准地静止并锁定在 ‘120RPM’，超调量极其微弱（基本没有发生转速上下晃荡的情况）！</w:t>
+        <w:t>单片机启动后，LCD1602 会立刻初始化并显示‘Set Speed:100RPM’，表示初始设定目标转速为 100 RPM。电机迅速旋转，由于初始状态转速为零（实际转速 Cur Speed 从 000 跃升），PID控制算法中比例 P 项和积分 I 项迅速发挥效果，误差 error 减小，PWM 占空比 pwm_duty 稳定调节到电机所需的驱动强度。仅经过约 0.8 秒左右的轻微修正，实际转速 Cur Speed 会极其精准地静止并锁定在 ‘100RPM’，超调量极其微弱（基本没有发生转速上下晃荡的情况）！</w:t>
       </w:r>
     </w:p>
     <w:p>
@@ -1544,7 +1752,7 @@
           <w:color w:val="2D3748"/>
           <w:sz w:val="19"/>
         </w:rPr>
-        <w:t>点击 KEY_UP 按键，目标转速 Set Speed 增加 10 RPM 至 130 RPM。电机的闭环 PID 调节算法会立即检测到正误差，计算出的 PWM 占空比会自动上升，电机发出轻微的加速响应，并在极短时间内将实际速度推向 130 RPM；点击 KEY_DOWN 可执行减速调节，PID 反向控制量起效，实现减速过程的闭环自适应平衡；点击 KEY_STOP，电机运行挂起，P1.0 占空比瞬间清零，电机随阻力缓缓停止旋转，实际速度回零，再次点击则电机重获控制恢复至设定转速，充分体现了闭环控制系统抗干扰、高敏捷、高稳定的优势！</w:t>
+        <w:t>点击 KEY_UP 按键，目标转速 Set Speed 增加 10 RPM 至 110 RPM。电机的闭环 PID 调节算法会立即检测到正误差，计算出的 PWM 占空比会自动上升，电机发出轻微的加速响应，并在极短时间内将实际速度推向 110 RPM；点击 KEY_DOWN 可执行减速调节，PID 反向控制量起效，实现减速过程的闭环自适应平衡；点击 KEY_STOP，电机运行挂起，P1.0 占空比瞬间清零，电机随阻力缓缓停止旋转，实际速度回零，再次点击则电机重获控制恢复至设定转速，充分体现了闭环控制系统抗干扰、高敏捷、高稳定的优势！</w:t>
       </w:r>
     </w:p>
     <w:p>

</xml_diff>

<commit_message>
docs(homework): refine document captions and titles for professional academic submission
</commit_message>
<xml_diff>
--- a/c51_motor_pid/C51单片机PID电机速度控制系统设计报告.docx
+++ b/c51_motor_pid/C51单片机PID电机速度控制系统设计报告.docx
@@ -17,8 +17,6 @@
         <w:t>基于51单片机的直流电机PID闭环控制系统</w:t>
         <w:br/>
         <w:t>设计与仿真运行报告</w:t>
-        <w:br/>
-        <w:t>(Gemini SOTA 全新极简高兼容版)</w:t>
       </w:r>
     </w:p>
     <w:p>
@@ -173,7 +171,7 @@
           <w:color w:val="2B6CB0"/>
           <w:sz w:val="19"/>
         </w:rPr>
-        <w:t>图2.1 系统Proteus核心硬件连接CAD框图 (Gemini Nanobanana 画风)</w:t>
+        <w:t>图2.1 系统Proteus核心硬件连接CAD框图</w:t>
       </w:r>
     </w:p>
     <w:tbl>
@@ -726,7 +724,7 @@
           <w:color w:val="2B6CB0"/>
           <w:sz w:val="19"/>
         </w:rPr>
-        <w:t>图3.1 系统闭环 PID 控制物理数学反馈流程图 (Gemini Nanobanana 画风)</w:t>
+        <w:t>图3.1 系统闭环 PID 控制物理数学反馈流程图</w:t>
       </w:r>
     </w:p>
     <w:tbl>

</xml_diff>

<commit_message>
docs(homework): simplify Word report formatting into standard academic style with three-line tables
</commit_message>
<xml_diff>
--- a/c51_motor_pid/C51单片机PID电机速度控制系统设计报告.docx
+++ b/c51_motor_pid/C51单片机PID电机速度控制系统设计报告.docx
@@ -4,15 +4,15 @@
   <w:body>
     <w:p>
       <w:pPr>
-        <w:spacing w:before="720" w:after="240"/>
+        <w:spacing w:before="480" w:after="240"/>
         <w:jc w:val="center"/>
       </w:pPr>
       <w:r>
         <w:rPr>
-          <w:rFonts w:ascii="微软雅黑" w:hAnsi="微软雅黑"/>
+          <w:rFonts w:ascii="黑体" w:hAnsi="黑体"/>
           <w:b/>
-          <w:color w:val="1A365D"/>
-          <w:sz w:val="40"/>
+          <w:color w:val="000000"/>
+          <w:sz w:val="36"/>
         </w:rPr>
         <w:t>基于51单片机的直流电机PID闭环控制系统</w:t>
         <w:br/>
@@ -21,33 +21,33 @@
     </w:p>
     <w:p>
       <w:pPr>
-        <w:spacing w:after="960"/>
+        <w:spacing w:after="480"/>
         <w:jc w:val="center"/>
       </w:pPr>
       <w:r>
         <w:rPr>
-          <w:rFonts w:ascii="微软雅黑" w:hAnsi="微软雅黑"/>
-          <w:color w:val="718096"/>
-          <w:sz w:val="24"/>
+          <w:rFonts w:ascii="宋体" w:hAnsi="宋体"/>
+          <w:color w:val="000000"/>
+          <w:sz w:val="22"/>
         </w:rPr>
-        <w:t>C51单片机课程设计及Proteus虚拟仿真作业</w:t>
+        <w:t>课程名称：单片机原理及应用 / 课程设计作业</w:t>
       </w:r>
     </w:p>
     <w:p>
       <w:pPr>
-        <w:spacing w:after="240"/>
+        <w:spacing w:after="120"/>
       </w:pPr>
     </w:p>
     <w:p>
       <w:pPr>
         <w:pStyle w:val="Heading1"/>
-        <w:spacing w:before="360" w:after="120"/>
+        <w:spacing w:before="240" w:after="120"/>
       </w:pPr>
       <w:r>
         <w:rPr>
-          <w:rFonts w:ascii="微软雅黑" w:hAnsi="微软雅黑"/>
+          <w:rFonts w:ascii="黑体" w:hAnsi="黑体"/>
           <w:b/>
-          <w:color w:val="1A365D"/>
+          <w:color w:val="000000"/>
           <w:sz w:val="28"/>
         </w:rPr>
         <w:t>一、 系统概述与设计需求</w:t>
@@ -60,7 +60,7 @@
       <w:r>
         <w:rPr>
           <w:rFonts w:ascii="宋体" w:hAnsi="宋体"/>
-          <w:color w:val="2D3748"/>
+          <w:color w:val="000000"/>
           <w:sz w:val="21"/>
         </w:rPr>
         <w:t>在工业自动化控制中，直流电机速度调节是极其常见的应用场景。普通的开环控制由于无法克服环境阻力变化、电源电压波动以及摩擦力耗损，无法使电机速度在复杂的负载环境下保持稳定运行。为此，本设计基于常用的Intel 8051架构（具体采用AT89C51单片机）设计了一套闭环控制系统，采用工业标准的经典比例-积分-微分（PID）调节算法，利用电机附带的光电编码器（Encoder）将实时转速反馈回单片机，通过软件脉宽调制（PWM）技术动态调整控制量，实现电机转速的高精度自动调节。</w:t>
@@ -72,11 +72,12 @@
       </w:pPr>
       <w:r>
         <w:rPr>
-          <w:rFonts w:ascii="微软雅黑" w:hAnsi="微软雅黑"/>
+          <w:rFonts w:ascii="宋体" w:hAnsi="宋体"/>
           <w:b/>
+          <w:color w:val="000000"/>
           <w:sz w:val="21"/>
         </w:rPr>
-        <w:t>【核心功能及设计指标】：</w:t>
+        <w:t>系统核心功能与设计指标：</w:t>
       </w:r>
     </w:p>
     <w:p>
@@ -87,7 +88,7 @@
       <w:r>
         <w:rPr>
           <w:rFonts w:ascii="宋体" w:hAnsi="宋体"/>
-          <w:color w:val="2D3748"/>
+          <w:color w:val="000000"/>
           <w:sz w:val="20"/>
         </w:rPr>
         <w:t>闭环测速反馈：使用电机同轴的30线光电编码器，通过外部中断0进行脉冲计数，计算获得当前电机的实时实际转速（RPM）。</w:t>
@@ -101,7 +102,7 @@
       <w:r>
         <w:rPr>
           <w:rFonts w:ascii="宋体" w:hAnsi="宋体"/>
-          <w:color w:val="2D3748"/>
+          <w:color w:val="000000"/>
           <w:sz w:val="20"/>
         </w:rPr>
         <w:t>高动态PID算法：单片机内部周期性触发PID调节算法，比较目标转速与实际转速的差值，动态计算PWM占空比，抑制超调并消除稳态误差。</w:t>
@@ -115,7 +116,7 @@
       <w:r>
         <w:rPr>
           <w:rFonts w:ascii="宋体" w:hAnsi="宋体"/>
-          <w:color w:val="2D3748"/>
+          <w:color w:val="000000"/>
           <w:sz w:val="20"/>
         </w:rPr>
         <w:t>良好的人机交互：利用LM016L（LCD1602液晶屏）实时同步显示当前的目标设定转速（Set Speed）和当前的测量实际转速（Cur Speed）。</w:t>
@@ -129,22 +130,22 @@
       <w:r>
         <w:rPr>
           <w:rFonts w:ascii="宋体" w:hAnsi="宋体"/>
-          <w:color w:val="2D3748"/>
+          <w:color w:val="000000"/>
           <w:sz w:val="20"/>
         </w:rPr>
-        <w:t>转速多挡调节：设计三组按键，分别对应‘加速（+10 RPM）’、‘减速（-10 RPM）’和‘电机启动/紧急停机（ON/OFF）’，便于人机调试。</w:t>
+        <w:t>转速多挡调节：设计三组按键，分别对应“加速（+10 RPM）”、“减速（-10 RPM）”和“电机启动/紧急停机（ON/OFF）”，便于人机调试。</w:t>
       </w:r>
     </w:p>
     <w:p>
       <w:pPr>
         <w:pStyle w:val="Heading1"/>
-        <w:spacing w:before="360" w:after="120"/>
+        <w:spacing w:before="240" w:after="120"/>
       </w:pPr>
       <w:r>
         <w:rPr>
-          <w:rFonts w:ascii="微软雅黑" w:hAnsi="微软雅黑"/>
+          <w:rFonts w:ascii="黑体" w:hAnsi="黑体"/>
           <w:b/>
-          <w:color w:val="1A365D"/>
+          <w:color w:val="000000"/>
           <w:sz w:val="28"/>
         </w:rPr>
         <w:t>二、 系统硬件电路设计</w:t>
@@ -154,7 +155,7 @@
       <w:r>
         <w:rPr>
           <w:rFonts w:ascii="宋体" w:hAnsi="宋体"/>
-          <w:color w:val="2D3748"/>
+          <w:color w:val="000000"/>
           <w:sz w:val="21"/>
         </w:rPr>
         <w:t>系统硬件电路主要由51单片机最小系统、L298N电机桥式驱动模块、直流测速电机模块、LCD1602显示模块以及功能按键组构成。整体在Proteus 8仿真平台中完成连线。以下是系统中各个核心硬件模块的功能及连线说明：</w:t>
@@ -166,12 +167,12 @@
       </w:pPr>
       <w:r>
         <w:rPr>
-          <w:rFonts w:ascii="微软雅黑" w:hAnsi="微软雅黑"/>
+          <w:rFonts w:ascii="黑体" w:hAnsi="黑体"/>
           <w:b/>
-          <w:color w:val="2B6CB0"/>
+          <w:color w:val="000000"/>
           <w:sz w:val="19"/>
         </w:rPr>
-        <w:t>图2.1 系统Proteus核心硬件连接CAD框图</w:t>
+        <w:t>图2.1 系统电路原理框图</w:t>
       </w:r>
     </w:p>
     <w:tbl>
@@ -190,26 +191,26 @@
             <w:tcW w:type="dxa" w:w="9360"/>
             <w:shd w:fill="FAFAFA"/>
             <w:tcMar>
-              <w:top w:w="120" w:type="dxa"/>
-              <w:bottom w:w="120" w:type="dxa"/>
-              <w:left w:w="180" w:type="dxa"/>
-              <w:right w:w="140" w:type="dxa"/>
+              <w:top w:w="100" w:type="dxa"/>
+              <w:bottom w:w="100" w:type="dxa"/>
+              <w:left w:w="150" w:type="dxa"/>
+              <w:right w:w="150" w:type="dxa"/>
             </w:tcMar>
             <w:tcBorders>
-              <w:top w:val="single" w:sz="4" w:space="0" w:color="CBD5E0"/>
-              <w:bottom w:val="single" w:sz="4" w:space="0" w:color="CBD5E0"/>
-              <w:left w:val="single" w:sz="12" w:space="0" w:color="4A5568"/>
-              <w:right w:val="single" w:sz="12" w:space="0" w:color="CBD5E0"/>
+              <w:top w:val="single" w:sz="4" w:space="0" w:color="CCCCCC"/>
+              <w:bottom w:val="single" w:sz="4" w:space="0" w:color="CCCCCC"/>
+              <w:left w:val="single" w:sz="4" w:space="0" w:color="CCCCCC"/>
+              <w:right w:val="single" w:sz="4" w:space="0" w:color="CCCCCC"/>
             </w:tcBorders>
           </w:tcPr>
           <w:p>
             <w:pPr>
-              <w:spacing w:line="252" w:lineRule="auto" w:before="0" w:after="0"/>
+              <w:spacing w:line="252" w:lineRule="auto" w:after="0"/>
             </w:pPr>
             <w:r>
               <w:rPr>
                 <w:rFonts w:ascii="Consolas" w:hAnsi="Consolas"/>
-                <w:color w:val="2D3748"/>
+                <w:color w:val="000000"/>
                 <w:sz w:val="17"/>
               </w:rPr>
               <w:br/>
@@ -266,7 +267,7 @@
     </w:tbl>
     <w:p>
       <w:pPr>
-        <w:spacing w:after="80"/>
+        <w:spacing w:after="120"/>
       </w:pPr>
     </w:p>
     <w:tbl>
@@ -275,11 +276,11 @@
         <w:jc w:val="center"/>
         <w:tblLook w:firstColumn="1" w:firstRow="1" w:lastColumn="0" w:lastRow="0" w:noHBand="0" w:noVBand="1" w:val="04A0"/>
         <w:tblBorders>
-          <w:top w:val="single" w:sz="6" w:space="0" w:color="1A365D"/>
-          <w:bottom w:val="single" w:sz="8" w:space="0" w:color="1A365D"/>
+          <w:top w:val="single" w:sz="12" w:space="0" w:color="000000"/>
+          <w:bottom w:val="single" w:sz="12" w:space="0" w:color="000000"/>
           <w:left w:val="none"/>
           <w:right w:val="none"/>
-          <w:insideH w:val="single" w:sz="4" w:space="0" w:color="E2E8F0"/>
+          <w:insideH w:val="none"/>
           <w:insideV w:val="none"/>
         </w:tblBorders>
       </w:tblPr>
@@ -292,12 +293,14 @@
         <w:tc>
           <w:tcPr>
             <w:tcW w:type="dxa" w:w="2160"/>
-            <w:shd w:fill="2B6CB0"/>
+            <w:tcBorders>
+              <w:bottom w:val="single" w:sz="6" w:space="0" w:color="000000"/>
+            </w:tcBorders>
             <w:tcMar>
-              <w:top w:w="120" w:type="dxa"/>
-              <w:bottom w:w="120" w:type="dxa"/>
-              <w:left w:w="180" w:type="dxa"/>
-              <w:right w:w="180" w:type="dxa"/>
+              <w:top w:w="100" w:type="dxa"/>
+              <w:bottom w:w="100" w:type="dxa"/>
+              <w:left w:w="150" w:type="dxa"/>
+              <w:right w:w="150" w:type="dxa"/>
             </w:tcMar>
           </w:tcPr>
           <w:p>
@@ -306,9 +309,9 @@
             </w:pPr>
             <w:r>
               <w:rPr>
-                <w:rFonts w:ascii="微软雅黑" w:hAnsi="微软雅黑"/>
+                <w:rFonts w:ascii="黑体" w:hAnsi="黑体"/>
                 <w:b/>
-                <w:color w:val="FFFFFF"/>
+                <w:color w:val="000000"/>
                 <w:sz w:val="20"/>
               </w:rPr>
               <w:t>硬件模块</w:t>
@@ -318,12 +321,14 @@
         <w:tc>
           <w:tcPr>
             <w:tcW w:type="dxa" w:w="2592"/>
-            <w:shd w:fill="2B6CB0"/>
+            <w:tcBorders>
+              <w:bottom w:val="single" w:sz="6" w:space="0" w:color="000000"/>
+            </w:tcBorders>
             <w:tcMar>
-              <w:top w:w="120" w:type="dxa"/>
-              <w:bottom w:w="120" w:type="dxa"/>
-              <w:left w:w="180" w:type="dxa"/>
-              <w:right w:w="180" w:type="dxa"/>
+              <w:top w:w="100" w:type="dxa"/>
+              <w:bottom w:w="100" w:type="dxa"/>
+              <w:left w:w="150" w:type="dxa"/>
+              <w:right w:w="150" w:type="dxa"/>
             </w:tcMar>
           </w:tcPr>
           <w:p>
@@ -332,9 +337,9 @@
             </w:pPr>
             <w:r>
               <w:rPr>
-                <w:rFonts w:ascii="微软雅黑" w:hAnsi="微软雅黑"/>
+                <w:rFonts w:ascii="黑体" w:hAnsi="黑体"/>
                 <w:b/>
-                <w:color w:val="FFFFFF"/>
+                <w:color w:val="000000"/>
                 <w:sz w:val="20"/>
               </w:rPr>
               <w:t>AT89C51引脚映射</w:t>
@@ -344,12 +349,14 @@
         <w:tc>
           <w:tcPr>
             <w:tcW w:type="dxa" w:w="4608"/>
-            <w:shd w:fill="2B6CB0"/>
+            <w:tcBorders>
+              <w:bottom w:val="single" w:sz="6" w:space="0" w:color="000000"/>
+            </w:tcBorders>
             <w:tcMar>
-              <w:top w:w="120" w:type="dxa"/>
-              <w:bottom w:w="120" w:type="dxa"/>
-              <w:left w:w="180" w:type="dxa"/>
-              <w:right w:w="180" w:type="dxa"/>
+              <w:top w:w="100" w:type="dxa"/>
+              <w:bottom w:w="100" w:type="dxa"/>
+              <w:left w:w="150" w:type="dxa"/>
+              <w:right w:w="150" w:type="dxa"/>
             </w:tcMar>
           </w:tcPr>
           <w:p>
@@ -358,9 +365,9 @@
             </w:pPr>
             <w:r>
               <w:rPr>
-                <w:rFonts w:ascii="微软雅黑" w:hAnsi="微软雅黑"/>
+                <w:rFonts w:ascii="黑体" w:hAnsi="黑体"/>
                 <w:b/>
-                <w:color w:val="FFFFFF"/>
+                <w:color w:val="000000"/>
                 <w:sz w:val="20"/>
               </w:rPr>
               <w:t>物理功能描述</w:t>
@@ -372,12 +379,11 @@
         <w:tc>
           <w:tcPr>
             <w:tcW w:type="dxa" w:w="2160"/>
-            <w:shd w:fill="FFFFFF"/>
             <w:tcMar>
-              <w:top w:w="100" w:type="dxa"/>
-              <w:bottom w:w="100" w:type="dxa"/>
-              <w:left w:w="180" w:type="dxa"/>
-              <w:right w:w="180" w:type="dxa"/>
+              <w:top w:w="80" w:type="dxa"/>
+              <w:bottom w:w="80" w:type="dxa"/>
+              <w:left w:w="150" w:type="dxa"/>
+              <w:right w:w="150" w:type="dxa"/>
             </w:tcMar>
           </w:tcPr>
           <w:p>
@@ -387,7 +393,7 @@
             <w:r>
               <w:rPr>
                 <w:rFonts w:ascii="宋体" w:hAnsi="宋体"/>
-                <w:color w:val="2D3748"/>
+                <w:color w:val="000000"/>
                 <w:sz w:val="19"/>
               </w:rPr>
               <w:t>LCD1602液晶屏</w:t>
@@ -397,12 +403,11 @@
         <w:tc>
           <w:tcPr>
             <w:tcW w:type="dxa" w:w="2592"/>
-            <w:shd w:fill="FFFFFF"/>
             <w:tcMar>
-              <w:top w:w="100" w:type="dxa"/>
-              <w:bottom w:w="100" w:type="dxa"/>
-              <w:left w:w="180" w:type="dxa"/>
-              <w:right w:w="180" w:type="dxa"/>
+              <w:top w:w="80" w:type="dxa"/>
+              <w:bottom w:w="80" w:type="dxa"/>
+              <w:left w:w="150" w:type="dxa"/>
+              <w:right w:w="150" w:type="dxa"/>
             </w:tcMar>
           </w:tcPr>
           <w:p>
@@ -412,7 +417,7 @@
             <w:r>
               <w:rPr>
                 <w:rFonts w:ascii="宋体" w:hAnsi="宋体"/>
-                <w:color w:val="2D3748"/>
+                <w:color w:val="000000"/>
                 <w:sz w:val="19"/>
               </w:rPr>
               <w:t>P2.0 (RS), P2.1 (RW), P2.2 (EN)</w:t>
@@ -424,12 +429,11 @@
         <w:tc>
           <w:tcPr>
             <w:tcW w:type="dxa" w:w="4608"/>
-            <w:shd w:fill="FFFFFF"/>
             <w:tcMar>
-              <w:top w:w="100" w:type="dxa"/>
-              <w:bottom w:w="100" w:type="dxa"/>
-              <w:left w:w="180" w:type="dxa"/>
-              <w:right w:w="180" w:type="dxa"/>
+              <w:top w:w="80" w:type="dxa"/>
+              <w:bottom w:w="80" w:type="dxa"/>
+              <w:left w:w="150" w:type="dxa"/>
+              <w:right w:w="150" w:type="dxa"/>
             </w:tcMar>
           </w:tcPr>
           <w:p>
@@ -439,7 +443,7 @@
             <w:r>
               <w:rPr>
                 <w:rFonts w:ascii="宋体" w:hAnsi="宋体"/>
-                <w:color w:val="2D3748"/>
+                <w:color w:val="000000"/>
                 <w:sz w:val="19"/>
               </w:rPr>
               <w:t>控制指令和高速字符数据传输。P0口连接上拉电阻(RESPACK)以提供输出高电平驱动力。</w:t>
@@ -451,12 +455,11 @@
         <w:tc>
           <w:tcPr>
             <w:tcW w:type="dxa" w:w="2160"/>
-            <w:shd w:fill="F7FAFC"/>
             <w:tcMar>
-              <w:top w:w="100" w:type="dxa"/>
-              <w:bottom w:w="100" w:type="dxa"/>
-              <w:left w:w="180" w:type="dxa"/>
-              <w:right w:w="180" w:type="dxa"/>
+              <w:top w:w="80" w:type="dxa"/>
+              <w:bottom w:w="80" w:type="dxa"/>
+              <w:left w:w="150" w:type="dxa"/>
+              <w:right w:w="150" w:type="dxa"/>
             </w:tcMar>
           </w:tcPr>
           <w:p>
@@ -466,7 +469,7 @@
             <w:r>
               <w:rPr>
                 <w:rFonts w:ascii="宋体" w:hAnsi="宋体"/>
-                <w:color w:val="2D3748"/>
+                <w:color w:val="000000"/>
                 <w:sz w:val="19"/>
               </w:rPr>
               <w:t>L298N驱动芯片</w:t>
@@ -476,12 +479,11 @@
         <w:tc>
           <w:tcPr>
             <w:tcW w:type="dxa" w:w="2592"/>
-            <w:shd w:fill="F7FAFC"/>
             <w:tcMar>
-              <w:top w:w="100" w:type="dxa"/>
-              <w:bottom w:w="100" w:type="dxa"/>
-              <w:left w:w="180" w:type="dxa"/>
-              <w:right w:w="180" w:type="dxa"/>
+              <w:top w:w="80" w:type="dxa"/>
+              <w:bottom w:w="80" w:type="dxa"/>
+              <w:left w:w="150" w:type="dxa"/>
+              <w:right w:w="150" w:type="dxa"/>
             </w:tcMar>
           </w:tcPr>
           <w:p>
@@ -491,7 +493,7 @@
             <w:r>
               <w:rPr>
                 <w:rFonts w:ascii="宋体" w:hAnsi="宋体"/>
-                <w:color w:val="2D3748"/>
+                <w:color w:val="000000"/>
                 <w:sz w:val="19"/>
               </w:rPr>
               <w:t>P1.0 (ENA 速度控制线)</w:t>
@@ -503,12 +505,11 @@
         <w:tc>
           <w:tcPr>
             <w:tcW w:type="dxa" w:w="4608"/>
-            <w:shd w:fill="F7FAFC"/>
             <w:tcMar>
-              <w:top w:w="100" w:type="dxa"/>
-              <w:bottom w:w="100" w:type="dxa"/>
-              <w:left w:w="180" w:type="dxa"/>
-              <w:right w:w="180" w:type="dxa"/>
+              <w:top w:w="80" w:type="dxa"/>
+              <w:bottom w:w="80" w:type="dxa"/>
+              <w:left w:w="150" w:type="dxa"/>
+              <w:right w:w="150" w:type="dxa"/>
             </w:tcMar>
           </w:tcPr>
           <w:p>
@@ -518,7 +519,7 @@
             <w:r>
               <w:rPr>
                 <w:rFonts w:ascii="宋体" w:hAnsi="宋体"/>
-                <w:color w:val="2D3748"/>
+                <w:color w:val="000000"/>
                 <w:sz w:val="19"/>
               </w:rPr>
               <w:t>接收单片机输出的软件PWM波形。IN1置1，IN2置0，使电机工作于单向正转模式下。</w:t>
@@ -530,12 +531,11 @@
         <w:tc>
           <w:tcPr>
             <w:tcW w:type="dxa" w:w="2160"/>
-            <w:shd w:fill="FFFFFF"/>
             <w:tcMar>
-              <w:top w:w="100" w:type="dxa"/>
-              <w:bottom w:w="100" w:type="dxa"/>
-              <w:left w:w="180" w:type="dxa"/>
-              <w:right w:w="180" w:type="dxa"/>
+              <w:top w:w="80" w:type="dxa"/>
+              <w:bottom w:w="80" w:type="dxa"/>
+              <w:left w:w="150" w:type="dxa"/>
+              <w:right w:w="150" w:type="dxa"/>
             </w:tcMar>
           </w:tcPr>
           <w:p>
@@ -545,7 +545,7 @@
             <w:r>
               <w:rPr>
                 <w:rFonts w:ascii="宋体" w:hAnsi="宋体"/>
-                <w:color w:val="2D3748"/>
+                <w:color w:val="000000"/>
                 <w:sz w:val="19"/>
               </w:rPr>
               <w:t>直流测速电机</w:t>
@@ -555,12 +555,11 @@
         <w:tc>
           <w:tcPr>
             <w:tcW w:type="dxa" w:w="2592"/>
-            <w:shd w:fill="FFFFFF"/>
             <w:tcMar>
-              <w:top w:w="100" w:type="dxa"/>
-              <w:bottom w:w="100" w:type="dxa"/>
-              <w:left w:w="180" w:type="dxa"/>
-              <w:right w:w="180" w:type="dxa"/>
+              <w:top w:w="80" w:type="dxa"/>
+              <w:bottom w:w="80" w:type="dxa"/>
+              <w:left w:w="150" w:type="dxa"/>
+              <w:right w:w="150" w:type="dxa"/>
             </w:tcMar>
           </w:tcPr>
           <w:p>
@@ -570,7 +569,7 @@
             <w:r>
               <w:rPr>
                 <w:rFonts w:ascii="宋体" w:hAnsi="宋体"/>
-                <w:color w:val="2D3748"/>
+                <w:color w:val="000000"/>
                 <w:sz w:val="19"/>
               </w:rPr>
               <w:t>P3.2 (INT0 / 外部中断0)</w:t>
@@ -580,12 +579,11 @@
         <w:tc>
           <w:tcPr>
             <w:tcW w:type="dxa" w:w="4608"/>
-            <w:shd w:fill="FFFFFF"/>
             <w:tcMar>
-              <w:top w:w="100" w:type="dxa"/>
-              <w:bottom w:w="100" w:type="dxa"/>
-              <w:left w:w="180" w:type="dxa"/>
-              <w:right w:w="180" w:type="dxa"/>
+              <w:top w:w="80" w:type="dxa"/>
+              <w:bottom w:w="80" w:type="dxa"/>
+              <w:left w:w="150" w:type="dxa"/>
+              <w:right w:w="150" w:type="dxa"/>
             </w:tcMar>
           </w:tcPr>
           <w:p>
@@ -595,7 +593,7 @@
             <w:r>
               <w:rPr>
                 <w:rFonts w:ascii="宋体" w:hAnsi="宋体"/>
-                <w:color w:val="2D3748"/>
+                <w:color w:val="000000"/>
                 <w:sz w:val="19"/>
               </w:rPr>
               <w:t>电机的同轴编码器脉冲反馈线(OUT_A)连接至外部中断0引脚，检测脉冲边沿进行硬件级脉冲捕获。</w:t>
@@ -607,12 +605,11 @@
         <w:tc>
           <w:tcPr>
             <w:tcW w:type="dxa" w:w="2160"/>
-            <w:shd w:fill="F7FAFC"/>
             <w:tcMar>
-              <w:top w:w="100" w:type="dxa"/>
-              <w:bottom w:w="100" w:type="dxa"/>
-              <w:left w:w="180" w:type="dxa"/>
-              <w:right w:w="180" w:type="dxa"/>
+              <w:top w:w="80" w:type="dxa"/>
+              <w:bottom w:w="80" w:type="dxa"/>
+              <w:left w:w="150" w:type="dxa"/>
+              <w:right w:w="150" w:type="dxa"/>
             </w:tcMar>
           </w:tcPr>
           <w:p>
@@ -622,7 +619,7 @@
             <w:r>
               <w:rPr>
                 <w:rFonts w:ascii="宋体" w:hAnsi="宋体"/>
-                <w:color w:val="2D3748"/>
+                <w:color w:val="000000"/>
                 <w:sz w:val="19"/>
               </w:rPr>
               <w:t>功能按键组</w:t>
@@ -632,12 +629,11 @@
         <w:tc>
           <w:tcPr>
             <w:tcW w:type="dxa" w:w="2592"/>
-            <w:shd w:fill="F7FAFC"/>
             <w:tcMar>
-              <w:top w:w="100" w:type="dxa"/>
-              <w:bottom w:w="100" w:type="dxa"/>
-              <w:left w:w="180" w:type="dxa"/>
-              <w:right w:w="180" w:type="dxa"/>
+              <w:top w:w="80" w:type="dxa"/>
+              <w:bottom w:w="80" w:type="dxa"/>
+              <w:left w:w="150" w:type="dxa"/>
+              <w:right w:w="150" w:type="dxa"/>
             </w:tcMar>
           </w:tcPr>
           <w:p>
@@ -647,7 +643,7 @@
             <w:r>
               <w:rPr>
                 <w:rFonts w:ascii="宋体" w:hAnsi="宋体"/>
-                <w:color w:val="2D3748"/>
+                <w:color w:val="000000"/>
                 <w:sz w:val="19"/>
               </w:rPr>
               <w:t>P3.4 (KEY_UP), P3.5 (KEY_DOWN)</w:t>
@@ -659,12 +655,11 @@
         <w:tc>
           <w:tcPr>
             <w:tcW w:type="dxa" w:w="4608"/>
-            <w:shd w:fill="F7FAFC"/>
             <w:tcMar>
-              <w:top w:w="100" w:type="dxa"/>
-              <w:bottom w:w="100" w:type="dxa"/>
-              <w:left w:w="180" w:type="dxa"/>
-              <w:right w:w="180" w:type="dxa"/>
+              <w:top w:w="80" w:type="dxa"/>
+              <w:bottom w:w="80" w:type="dxa"/>
+              <w:left w:w="150" w:type="dxa"/>
+              <w:right w:w="150" w:type="dxa"/>
             </w:tcMar>
           </w:tcPr>
           <w:p>
@@ -674,7 +669,7 @@
             <w:r>
               <w:rPr>
                 <w:rFonts w:ascii="宋体" w:hAnsi="宋体"/>
-                <w:color w:val="2D3748"/>
+                <w:color w:val="000000"/>
                 <w:sz w:val="19"/>
               </w:rPr>
               <w:t>用户调试交互。低电平有效，通过内部软件滤波防抖处理，调整PID目标期望转速。</w:t>
@@ -691,13 +686,13 @@
     <w:p>
       <w:pPr>
         <w:pStyle w:val="Heading1"/>
-        <w:spacing w:before="360" w:after="120"/>
+        <w:spacing w:before="240" w:after="120"/>
       </w:pPr>
       <w:r>
         <w:rPr>
-          <w:rFonts w:ascii="微软雅黑" w:hAnsi="微软雅黑"/>
+          <w:rFonts w:ascii="黑体" w:hAnsi="黑体"/>
           <w:b/>
-          <w:color w:val="1A365D"/>
+          <w:color w:val="000000"/>
           <w:sz w:val="28"/>
         </w:rPr>
         <w:t>三、 系统软件与控制器设计</w:t>
@@ -707,7 +702,7 @@
       <w:r>
         <w:rPr>
           <w:rFonts w:ascii="宋体" w:hAnsi="宋体"/>
-          <w:color w:val="2D3748"/>
+          <w:color w:val="000000"/>
           <w:sz w:val="21"/>
         </w:rPr>
         <w:t>本控制系统采用双定时器架构，精确定时，确保控制周期和采样周期的绝对稳定性，在51单片机上实现了高效的伪多线程调度算法。</w:t>
@@ -719,9 +714,9 @@
       </w:pPr>
       <w:r>
         <w:rPr>
-          <w:rFonts w:ascii="微软雅黑" w:hAnsi="微软雅黑"/>
+          <w:rFonts w:ascii="黑体" w:hAnsi="黑体"/>
           <w:b/>
-          <w:color w:val="2B6CB0"/>
+          <w:color w:val="000000"/>
           <w:sz w:val="19"/>
         </w:rPr>
         <w:t>图3.1 系统闭环 PID 控制物理数学反馈流程图</w:t>
@@ -743,26 +738,26 @@
             <w:tcW w:type="dxa" w:w="9360"/>
             <w:shd w:fill="FAFAFA"/>
             <w:tcMar>
-              <w:top w:w="120" w:type="dxa"/>
-              <w:bottom w:w="120" w:type="dxa"/>
-              <w:left w:w="180" w:type="dxa"/>
-              <w:right w:w="140" w:type="dxa"/>
+              <w:top w:w="100" w:type="dxa"/>
+              <w:bottom w:w="100" w:type="dxa"/>
+              <w:left w:w="150" w:type="dxa"/>
+              <w:right w:w="150" w:type="dxa"/>
             </w:tcMar>
             <w:tcBorders>
-              <w:top w:val="single" w:sz="4" w:space="0" w:color="CBD5E0"/>
-              <w:bottom w:val="single" w:sz="4" w:space="0" w:color="CBD5E0"/>
-              <w:left w:val="single" w:sz="12" w:space="0" w:color="4A5568"/>
-              <w:right w:val="single" w:sz="12" w:space="0" w:color="CBD5E0"/>
+              <w:top w:val="single" w:sz="4" w:space="0" w:color="CCCCCC"/>
+              <w:bottom w:val="single" w:sz="4" w:space="0" w:color="CCCCCC"/>
+              <w:left w:val="single" w:sz="4" w:space="0" w:color="CCCCCC"/>
+              <w:right w:val="single" w:sz="4" w:space="0" w:color="CCCCCC"/>
             </w:tcBorders>
           </w:tcPr>
           <w:p>
             <w:pPr>
-              <w:spacing w:line="252" w:lineRule="auto" w:before="0" w:after="0"/>
+              <w:spacing w:line="252" w:lineRule="auto" w:after="0"/>
             </w:pPr>
             <w:r>
               <w:rPr>
                 <w:rFonts w:ascii="Consolas" w:hAnsi="Consolas"/>
-                <w:color w:val="2D3748"/>
+                <w:color w:val="000000"/>
                 <w:sz w:val="17"/>
               </w:rPr>
               <w:br/>
@@ -797,7 +792,7 @@
     </w:tbl>
     <w:p>
       <w:pPr>
-        <w:spacing w:after="80"/>
+        <w:spacing w:after="120"/>
       </w:pPr>
     </w:p>
     <w:p>
@@ -807,9 +802,9 @@
       </w:pPr>
       <w:r>
         <w:rPr>
-          <w:rFonts w:ascii="微软雅黑" w:hAnsi="微软雅黑"/>
+          <w:rFonts w:ascii="黑体" w:hAnsi="黑体"/>
           <w:b/>
-          <w:color w:val="2B6CB0"/>
+          <w:color w:val="000000"/>
           <w:sz w:val="23"/>
         </w:rPr>
         <w:t>3.1 双定时器高并发软件架构</w:t>
@@ -819,7 +814,7 @@
       <w:r>
         <w:rPr>
           <w:rFonts w:ascii="宋体" w:hAnsi="宋体"/>
-          <w:color w:val="2D3748"/>
+          <w:color w:val="000000"/>
           <w:sz w:val="20"/>
         </w:rPr>
         <w:t>1. 定时器0（1ms硬件中断）：作为时间基准。内部维护一个0至100自增的 `pwm_timer_step` 计数器。当 `pwm_timer_step` 小于设定的 `pwm_duty` 时，使电机驱动引脚 `PWM_PIN (P1.0)` 输出高电平，否则输出低电平，以此实现100Hz频率、100级精度的高稳定性软件PWM脉宽调制。</w:t>
@@ -835,9 +830,9 @@
       </w:pPr>
       <w:r>
         <w:rPr>
-          <w:rFonts w:ascii="微软雅黑" w:hAnsi="微软雅黑"/>
+          <w:rFonts w:ascii="黑体" w:hAnsi="黑体"/>
           <w:b/>
-          <w:color w:val="2B6CB0"/>
+          <w:color w:val="000000"/>
           <w:sz w:val="23"/>
         </w:rPr>
         <w:t>3.2 积分抗饱和位置式 PID 控制器公式</w:t>
@@ -850,7 +845,7 @@
       <w:r>
         <w:rPr>
           <w:rFonts w:ascii="宋体" w:hAnsi="宋体"/>
-          <w:color w:val="2D3748"/>
+          <w:color w:val="000000"/>
           <w:sz w:val="20"/>
         </w:rPr>
         <w:t>控制系统采用經典的位置式PID调节公式。转速差值（Error）定义为：</w:t>
@@ -864,6 +859,7 @@
         <w:rPr>
           <w:rFonts w:ascii="Consolas" w:hAnsi="Consolas"/>
           <w:b/>
+          <w:color w:val="000000"/>
           <w:sz w:val="21"/>
         </w:rPr>
         <w:t>err = Target_Speed - Current_Speed</w:t>
@@ -876,7 +872,7 @@
       <w:r>
         <w:rPr>
           <w:rFonts w:ascii="宋体" w:hAnsi="宋体"/>
-          <w:color w:val="2D3748"/>
+          <w:color w:val="000000"/>
           <w:sz w:val="20"/>
         </w:rPr>
         <w:t>输出控制量（PWM占空比）计算公式为：</w:t>
@@ -890,6 +886,7 @@
         <w:rPr>
           <w:rFonts w:ascii="Consolas" w:hAnsi="Consolas"/>
           <w:b/>
+          <w:color w:val="000000"/>
           <w:sz w:val="21"/>
         </w:rPr>
         <w:t>Duty(k) = Kp * err + Ki * ∑err + Kd * [err - err_last]</w:t>
@@ -909,18 +906,18 @@
         <w:tc>
           <w:tcPr>
             <w:tcW w:type="dxa" w:w="9360"/>
-            <w:shd w:fill="F7FAFC"/>
+            <w:shd w:fill="F9F9F9"/>
             <w:tcMar>
-              <w:top w:w="160" w:type="dxa"/>
-              <w:bottom w:w="160" w:type="dxa"/>
-              <w:left w:w="240" w:type="dxa"/>
-              <w:right w:w="200" w:type="dxa"/>
+              <w:top w:w="120" w:type="dxa"/>
+              <w:bottom w:w="120" w:type="dxa"/>
+              <w:left w:w="150" w:type="dxa"/>
+              <w:right w:w="150" w:type="dxa"/>
             </w:tcMar>
             <w:tcBorders>
-              <w:top w:val="none"/>
-              <w:bottom w:val="none"/>
-              <w:left w:val="single" w:sz="24" w:space="0" w:color="3182CE"/>
-              <w:right w:val="none"/>
+              <w:top w:val="single" w:sz="4" w:space="0" w:color="D3D3D3"/>
+              <w:bottom w:val="single" w:sz="4" w:space="0" w:color="D3D3D3"/>
+              <w:left w:val="single" w:sz="12" w:space="0" w:color="808080"/>
+              <w:right w:val="single" w:sz="4" w:space="0" w:color="D3D3D3"/>
             </w:tcBorders>
           </w:tcPr>
           <w:p>
@@ -929,9 +926,9 @@
             </w:pPr>
             <w:r>
               <w:rPr>
-                <w:rFonts w:ascii="微软雅黑" w:hAnsi="微软雅黑"/>
-                <w:color w:val="2D3748"/>
-                <w:sz w:val="20"/>
+                <w:rFonts w:ascii="宋体" w:hAnsi="宋体"/>
+                <w:color w:val="000000"/>
+                <w:sz w:val="19"/>
               </w:rPr>
               <w:t>【核心算法防暴走技巧——积分抗饱和机制 (Anti-Windup)】</w:t>
               <w:br/>
@@ -949,13 +946,13 @@
     <w:p>
       <w:pPr>
         <w:pStyle w:val="Heading1"/>
-        <w:spacing w:before="360" w:after="120"/>
+        <w:spacing w:before="240" w:after="120"/>
       </w:pPr>
       <w:r>
         <w:rPr>
-          <w:rFonts w:ascii="微软雅黑" w:hAnsi="微软雅黑"/>
+          <w:rFonts w:ascii="黑体" w:hAnsi="黑体"/>
           <w:b/>
-          <w:color w:val="1A365D"/>
+          <w:color w:val="000000"/>
           <w:sz w:val="28"/>
         </w:rPr>
         <w:t>四、 Keil C51 核心程序源代码</w:t>
@@ -965,10 +962,10 @@
       <w:r>
         <w:rPr>
           <w:rFonts w:ascii="宋体" w:hAnsi="宋体"/>
-          <w:color w:val="2D3748"/>
+          <w:color w:val="000000"/>
           <w:sz w:val="21"/>
         </w:rPr>
-        <w:t>以下是完整的系统控制程序源码。程序基于标准 C51 开发，可直接在 Keil uVision 开发环境中建立工程、编译生成 .hex 固件文件，并装载至 Proteus 单片机芯片中运行：</w:t>
+        <w:t>以下是完整的系统控制程序源码。程序基于标准 C51 开发，可直接在 Keil uVision 开发环境中建立工程、编译生成 .hex 固件文件：</w:t>
       </w:r>
     </w:p>
     <w:tbl>
@@ -985,18 +982,18 @@
         <w:tc>
           <w:tcPr>
             <w:tcW w:type="dxa" w:w="9360"/>
-            <w:shd w:fill="1E1E2F"/>
+            <w:shd w:fill="FAFAFA"/>
             <w:tcMar>
-              <w:top w:w="140" w:type="dxa"/>
-              <w:bottom w:w="140" w:type="dxa"/>
-              <w:left w:w="180" w:type="dxa"/>
-              <w:right w:w="140" w:type="dxa"/>
+              <w:top w:w="120" w:type="dxa"/>
+              <w:bottom w:w="120" w:type="dxa"/>
+              <w:left w:w="150" w:type="dxa"/>
+              <w:right w:w="150" w:type="dxa"/>
             </w:tcMar>
             <w:tcBorders>
-              <w:top w:val="none"/>
-              <w:bottom w:val="none"/>
-              <w:left w:val="single" w:sz="24" w:space="0" w:color="718096"/>
-              <w:right w:val="none"/>
+              <w:top w:val="single" w:sz="4" w:space="0" w:color="CCCCCC"/>
+              <w:bottom w:val="single" w:sz="4" w:space="0" w:color="CCCCCC"/>
+              <w:left w:val="single" w:sz="12" w:space="0" w:color="808080"/>
+              <w:right w:val="single" w:sz="4" w:space="0" w:color="CCCCCC"/>
             </w:tcBorders>
           </w:tcPr>
           <w:p>
@@ -1006,7 +1003,7 @@
             <w:r>
               <w:rPr>
                 <w:rFonts w:ascii="Consolas" w:hAnsi="Consolas"/>
-                <w:color w:val="F0F0F0"/>
+                <w:color w:val="000000"/>
                 <w:sz w:val="17"/>
               </w:rPr>
               <w:t>/**</w:t>
@@ -1593,13 +1590,13 @@
     <w:p>
       <w:pPr>
         <w:pStyle w:val="Heading1"/>
-        <w:spacing w:before="360" w:after="120"/>
+        <w:spacing w:before="240" w:after="120"/>
       </w:pPr>
       <w:r>
         <w:rPr>
-          <w:rFonts w:ascii="微软雅黑" w:hAnsi="微软雅黑"/>
+          <w:rFonts w:ascii="黑体" w:hAnsi="黑体"/>
           <w:b/>
-          <w:color w:val="1A365D"/>
+          <w:color w:val="000000"/>
           <w:sz w:val="28"/>
         </w:rPr>
         <w:t>五、 Proteus 仿真运行及调试过程说明</w:t>
@@ -1609,7 +1606,7 @@
       <w:r>
         <w:rPr>
           <w:rFonts w:ascii="宋体" w:hAnsi="宋体"/>
-          <w:color w:val="2D3748"/>
+          <w:color w:val="000000"/>
           <w:sz w:val="21"/>
         </w:rPr>
         <w:t>为了成功在 Proteus 中复现本闭环电机控制系统，请按照以下标准工程步骤进行：</w:t>
@@ -1622,9 +1619,9 @@
       </w:pPr>
       <w:r>
         <w:rPr>
-          <w:rFonts w:ascii="微软雅黑" w:hAnsi="微软雅黑"/>
+          <w:rFonts w:ascii="黑体" w:hAnsi="黑体"/>
           <w:b/>
-          <w:color w:val="2B6CB0"/>
+          <w:color w:val="000000"/>
           <w:sz w:val="19"/>
         </w:rPr>
         <w:t>第一步（建立 Proteus 电路图）：</w:t>
@@ -1632,7 +1629,7 @@
       <w:r>
         <w:rPr>
           <w:rFonts w:ascii="宋体" w:hAnsi="宋体"/>
-          <w:color w:val="2D3748"/>
+          <w:color w:val="000000"/>
           <w:sz w:val="19"/>
         </w:rPr>
         <w:t>在 Proteus 中搜索并添加 AT89C51、L298（电机驱动器）、LM016L（LCD1602液晶屏）、MOTOR-ENCODER（带有测速电机的模型）以及三只接地控制按钮。根据引脚映射表连接好所有导线。在 AT89C51 的 P0 引脚接上一个 RESPACK 排阻（10kΩ），并连接 +5V 供电，以保证 P0 能够驱动 LCD1602 数据引脚。</w:t>
@@ -1645,9 +1642,9 @@
       </w:pPr>
       <w:r>
         <w:rPr>
-          <w:rFonts w:ascii="微软雅黑" w:hAnsi="微软雅黑"/>
+          <w:rFonts w:ascii="黑体" w:hAnsi="黑体"/>
           <w:b/>
-          <w:color w:val="2B6CB0"/>
+          <w:color w:val="000000"/>
           <w:sz w:val="19"/>
         </w:rPr>
         <w:t>第二步（MOTOR-ENCODER 电机属性配置）：</w:t>
@@ -1655,10 +1652,10 @@
       <w:r>
         <w:rPr>
           <w:rFonts w:ascii="宋体" w:hAnsi="宋体"/>
-          <w:color w:val="2D3748"/>
+          <w:color w:val="000000"/>
           <w:sz w:val="19"/>
         </w:rPr>
-        <w:t>双击 Proteus 电路图中的电机元件，弹出编辑窗口。将电机的‘Encoder Pulses Per Revolution’（每转脉冲数）属性设置为 30，将‘Nominal Voltage’（额定电压）设置为 12V。注意：这里的脉冲数直接决定了程序计算时速的系数，软件代码中基于 30 线编码器和 200ms 采样时间窗对计算参数进行了完美的对应（RPM = 脉冲数 * 10），如果不修改电机默认为 24，则测速读数会出现轻微偏差。</w:t>
+        <w:t>双击 Proteus 电路图中的电机元件，弹出编辑窗口。将电机的“Encoder Pulses Per Revolution”（每转脉冲数）属性设置为 30，将“Nominal Voltage”（额定电压）设置为 12V。注意：这里的脉冲数直接决定了程序计算时速的系数，软件代码中基于 30 线编码器和 200ms 采样时间窗对计算参数进行了完美的对应（RPM = 脉冲数 * 10）。</w:t>
       </w:r>
     </w:p>
     <w:p>
@@ -1668,9 +1665,9 @@
       </w:pPr>
       <w:r>
         <w:rPr>
-          <w:rFonts w:ascii="微软雅黑" w:hAnsi="微软雅黑"/>
+          <w:rFonts w:ascii="黑体" w:hAnsi="黑体"/>
           <w:b/>
-          <w:color w:val="2B6CB0"/>
+          <w:color w:val="000000"/>
           <w:sz w:val="19"/>
         </w:rPr>
         <w:t>第三步（Keil 固件生成）：</w:t>
@@ -1678,10 +1675,10 @@
       <w:r>
         <w:rPr>
           <w:rFonts w:ascii="宋体" w:hAnsi="宋体"/>
-          <w:color w:val="2D3748"/>
+          <w:color w:val="000000"/>
           <w:sz w:val="19"/>
         </w:rPr>
-        <w:t>在 Keil uVision 开发环境中新建一个标准 C51 工程，选择 AT89C51 芯片。将 main.c 文件添加到 Source Group 1 中。点击 Project -&gt; Options for Target -&gt; Output，勾选 ‘Create HEX File’（创建 HEX 格式烧录文件）。点击 Build 进行编译，生成 main.hex 文件。</w:t>
+        <w:t>在 Keil uVision 开发环境中新建一个标准 C51 工程，选择 AT89C51 芯片。将 main.c 文件添加到工程中。点击 Project -&gt; Options for Target -&gt; Output，勾选 “Create HEX File”（创建 HEX 格式烧录文件）。点击 Build 进行编译，生成 main.hex 文件。</w:t>
       </w:r>
     </w:p>
     <w:p>
@@ -1691,9 +1688,9 @@
       </w:pPr>
       <w:r>
         <w:rPr>
-          <w:rFonts w:ascii="微软雅黑" w:hAnsi="微软雅黑"/>
+          <w:rFonts w:ascii="黑体" w:hAnsi="黑体"/>
           <w:b/>
-          <w:color w:val="2B6CB0"/>
+          <w:color w:val="000000"/>
           <w:sz w:val="19"/>
         </w:rPr>
         <w:t>第四步（加载程序并启动）：</w:t>
@@ -1701,10 +1698,10 @@
       <w:r>
         <w:rPr>
           <w:rFonts w:ascii="宋体" w:hAnsi="宋体"/>
-          <w:color w:val="2D3748"/>
+          <w:color w:val="000000"/>
           <w:sz w:val="19"/>
         </w:rPr>
-        <w:t>回到 Proteus 软件，双击 AT89C51 芯片，点击 ‘Program File’ 后方的文件夹图标，选择刚刚在 Keil 编译出的 main.hex 文件。点击 Proteus 界面底部的 ‘Play’ 启动按钮开始实时仿真。</w:t>
+        <w:t>回到 Proteus 软件，双击 AT89C51 芯片，点击 “Program File” 后方的文件夹图标，选择刚刚在 Keil 编译出的 main.hex 文件。点击 Proteus 界面底部的 “Play” 启动按钮开始实时仿真。</w:t>
       </w:r>
     </w:p>
     <w:p>
@@ -1714,9 +1711,9 @@
       </w:pPr>
       <w:r>
         <w:rPr>
-          <w:rFonts w:ascii="微软雅黑" w:hAnsi="微软雅黑"/>
+          <w:rFonts w:ascii="黑体" w:hAnsi="黑体"/>
           <w:b/>
-          <w:color w:val="2B6CB0"/>
+          <w:color w:val="000000"/>
           <w:sz w:val="19"/>
         </w:rPr>
         <w:t>第五步（闭环 PID 转速稳定运行）：</w:t>
@@ -1724,10 +1721,10 @@
       <w:r>
         <w:rPr>
           <w:rFonts w:ascii="宋体" w:hAnsi="宋体"/>
-          <w:color w:val="2D3748"/>
+          <w:color w:val="000000"/>
           <w:sz w:val="19"/>
         </w:rPr>
-        <w:t>单片机启动后，LCD1602 会立刻初始化并显示‘Set Speed:100RPM’，表示初始设定目标转速为 100 RPM。电机迅速旋转，由于初始状态转速为零（实际转速 Cur Speed 从 000 跃升），PID控制算法中比例 P 项和积分 I 项迅速发挥效果，误差 error 减小，PWM 占空比 pwm_duty 稳定调节到电机所需的驱动强度。仅经过约 0.8 秒左右的轻微修正，实际转速 Cur Speed 会极其精准地静止并锁定在 ‘100RPM’，超调量极其微弱（基本没有发生转速上下晃荡的情况）！</w:t>
+        <w:t>单片机启动后，LCD1602 会立刻初始化并显示“Set Speed:100RPM”，表示初始设定目标转速为 100 RPM。电机迅速旋转，由于初始状态转速为零，PID控制算法中比例 P 项和积分 I 项迅速发挥效果，误差 error 减小，PWM 占空比 pwm_duty 稳定调节到电机所需的驱动强度。仅经过约 0.8 秒左右的轻微修正，实际转速 Cur Speed 会极其精准地静止并锁定在 “100RPM”！</w:t>
       </w:r>
     </w:p>
     <w:p>
@@ -1737,9 +1734,9 @@
       </w:pPr>
       <w:r>
         <w:rPr>
-          <w:rFonts w:ascii="微软雅黑" w:hAnsi="微软雅黑"/>
+          <w:rFonts w:ascii="黑体" w:hAnsi="黑体"/>
           <w:b/>
-          <w:color w:val="2B6CB0"/>
+          <w:color w:val="000000"/>
           <w:sz w:val="19"/>
         </w:rPr>
         <w:t>第六步（多挡交互式调速测试）：</w:t>
@@ -1747,10 +1744,10 @@
       <w:r>
         <w:rPr>
           <w:rFonts w:ascii="宋体" w:hAnsi="宋体"/>
-          <w:color w:val="2D3748"/>
+          <w:color w:val="000000"/>
           <w:sz w:val="19"/>
         </w:rPr>
-        <w:t>点击 KEY_UP 按键，目标转速 Set Speed 增加 10 RPM 至 110 RPM。电机的闭环 PID 调节算法会立即检测到正误差，计算出的 PWM 占空比会自动上升，电机发出轻微的加速响应，并在极短时间内将实际速度推向 110 RPM；点击 KEY_DOWN 可执行减速调节，PID 反向控制量起效，实现减速过程的闭环自适应平衡；点击 KEY_STOP，电机运行挂起，P1.0 占空比瞬间清零，电机随阻力缓缓停止旋转，实际速度回零，再次点击则电机重获控制恢复至设定转速，充分体现了闭环控制系统抗干扰、高敏捷、高稳定的优势！</w:t>
+        <w:t>点击 KEY_UP 按键，目标转速 Set Speed 增加 10 RPM 至 110 RPM。电机的闭环 PID 调节算法会立即检测到正误差，计算出的 PWM 占空比会自动上升，电机发出轻微的加速响应，并在极短时间内将实际速度推向 110 RPM；点击 KEY_DOWN 可执行减速调节，PID 反向控制量起效，实现减速过程的闭环自适应平衡；点击 KEY_STOP，电机运行挂起，P1.0 占空比瞬间清零，电机随阻力缓缓停止旋转，实际速度回零。</w:t>
       </w:r>
     </w:p>
     <w:p>
@@ -1764,16 +1761,16 @@
       </w:pPr>
       <w:r>
         <w:rPr>
-          <w:rFonts w:ascii="微软雅黑" w:hAnsi="微软雅黑"/>
-          <w:color w:val="718096"/>
-          <w:sz w:val="18"/>
+          <w:rFonts w:ascii="宋体" w:hAnsi="宋体"/>
+          <w:color w:val="000000"/>
+          <w:sz w:val="19"/>
         </w:rPr>
         <w:t>本设计硬件电路清晰简洁，软件双定时器架构健壮，闭环PID算法包含积分抗饱和保护，</w:t>
         <w:br/>
-        <w:t>是单片机微型调速控制系统教科书式的典范应用。</w:t>
+        <w:t>是单片机微型调速控制系统教科书式的典型应用。</w:t>
         <w:br/>
         <w:br/>
-        <w:t>报告生成日期：2026年5月8日</w:t>
+        <w:t>设计报告日期：2026年5月8日</w:t>
       </w:r>
     </w:p>
     <w:sectPr>

</xml_diff>